<commit_message>
documentation: matchgame with backend
</commit_message>
<xml_diff>
--- a/documentation/Koodidokumentin ohje_MatchGame.docx
+++ b/documentation/Koodidokumentin ohje_MatchGame.docx
@@ -2172,13 +2172,16 @@
       </w:pPr>
       <w:r>
         <w:rPr/>
-        <w:t>Login Scene</w:t>
-      </w:r>
-    </w:p>
-    <w:p>
-      <w:pPr>
-        <w:pStyle w:val="Normaali"/>
-      </w:pPr>
+        <w:t>Login</w:t>
+      </w:r>
+      <w:r>
+        <w:rPr/>
+        <w:t xml:space="preserve"> </w:t>
+      </w:r>
+      <w:r>
+        <w:rPr/>
+        <w:t>Scene</w:t>
+      </w:r>
     </w:p>
     <w:p>
       <w:pPr>
@@ -2420,11 +2423,13 @@
     <w:p>
       <w:pPr>
         <w:pStyle w:val="Luettelokappale"/>
-        <w:ind w:left="720"/>
+        <w:spacing w:before="240" w:beforeAutospacing="off" w:after="240" w:afterAutospacing="off"/>
+        <w:ind/>
+        <w:jc w:val="left"/>
       </w:pPr>
       <w:r>
         <w:drawing>
-          <wp:inline wp14:editId="6269F368" wp14:anchorId="560FA1E5">
+          <wp:inline wp14:editId="250C0854" wp14:anchorId="560FA1E5">
             <wp:extent cx="6229350" cy="3524250"/>
             <wp:effectExtent l="0" t="0" r="0" b="0"/>
             <wp:docPr id="1405445655" name="drawing"/>
@@ -2467,14 +2472,143 @@
       </w:r>
     </w:p>
     <w:p>
-      <w:r>
-        <w:br w:type="page"/>
+      <w:pPr>
+        <w:spacing w:before="240" w:beforeAutospacing="off" w:after="240" w:afterAutospacing="off"/>
+        <w:ind/>
+        <w:jc w:val="left"/>
+        <w:rPr>
+          <w:rFonts w:ascii="Calibri" w:hAnsi="Calibri" w:eastAsia="Calibri" w:cs="Calibri"/>
+          <w:noProof w:val="0"/>
+          <w:sz w:val="20"/>
+          <w:szCs w:val="20"/>
+          <w:lang w:val="en-US"/>
+        </w:rPr>
+      </w:pPr>
+      <w:r>
+        <w:drawing>
+          <wp:inline wp14:editId="7D659DD6" wp14:anchorId="34BDA59A">
+            <wp:extent cx="6229350" cy="3543300"/>
+            <wp:effectExtent l="0" t="0" r="0" b="0"/>
+            <wp:docPr id="1733595776" name="drawing"/>
+            <wp:cNvGraphicFramePr>
+              <a:graphicFrameLocks noChangeAspect="1"/>
+            </wp:cNvGraphicFramePr>
+            <a:graphic>
+              <a:graphicData xmlns:a="http://schemas.openxmlformats.org/drawingml/2006/main" uri="http://schemas.openxmlformats.org/drawingml/2006/picture">
+                <pic:pic xmlns:pic="http://schemas.openxmlformats.org/drawingml/2006/picture">
+                  <pic:nvPicPr>
+                    <pic:cNvPr id="185935467" name=""/>
+                    <pic:cNvPicPr/>
+                  </pic:nvPicPr>
+                  <pic:blipFill>
+                    <a:blip xmlns:r="http://schemas.openxmlformats.org/officeDocument/2006/relationships" r:embed="rId1049370118">
+                      <a:extLst>
+                        <a:ext xmlns:a="http://schemas.openxmlformats.org/drawingml/2006/main" uri="{28A0092B-C50C-407E-A947-70E740481C1C}">
+                          <a14:useLocalDpi xmlns:a14="http://schemas.microsoft.com/office/drawing/2010/main" val="0"/>
+                        </a:ext>
+                      </a:extLst>
+                    </a:blip>
+                    <a:stretch>
+                      <a:fillRect/>
+                    </a:stretch>
+                  </pic:blipFill>
+                  <pic:spPr>
+                    <a:xfrm>
+                      <a:off x="0" y="0"/>
+                      <a:ext cx="6229350" cy="3543300"/>
+                    </a:xfrm>
+                    <a:prstGeom prst="rect">
+                      <a:avLst/>
+                    </a:prstGeom>
+                  </pic:spPr>
+                </pic:pic>
+              </a:graphicData>
+            </a:graphic>
+          </wp:inline>
+        </w:drawing>
+      </w:r>
+    </w:p>
+    <w:p>
+      <w:pPr>
+        <w:spacing w:before="240" w:beforeAutospacing="off" w:after="240" w:afterAutospacing="off"/>
+        <w:ind/>
+        <w:jc w:val="left"/>
+        <w:rPr>
+          <w:rFonts w:ascii="Calibri" w:hAnsi="Calibri" w:eastAsia="Calibri" w:cs="Calibri"/>
+          <w:noProof w:val="0"/>
+          <w:sz w:val="20"/>
+          <w:szCs w:val="20"/>
+          <w:lang w:val="en-US"/>
+        </w:rPr>
+      </w:pPr>
+      <w:r>
+        <w:drawing>
+          <wp:inline wp14:editId="310B275F" wp14:anchorId="6C2C54D0">
+            <wp:extent cx="6229350" cy="3524250"/>
+            <wp:effectExtent l="0" t="0" r="0" b="0"/>
+            <wp:docPr id="949825740" name="drawing"/>
+            <wp:cNvGraphicFramePr>
+              <a:graphicFrameLocks noChangeAspect="1"/>
+            </wp:cNvGraphicFramePr>
+            <a:graphic>
+              <a:graphicData xmlns:a="http://schemas.openxmlformats.org/drawingml/2006/main" uri="http://schemas.openxmlformats.org/drawingml/2006/picture">
+                <pic:pic xmlns:pic="http://schemas.openxmlformats.org/drawingml/2006/picture">
+                  <pic:nvPicPr>
+                    <pic:cNvPr id="1273837192" name=""/>
+                    <pic:cNvPicPr/>
+                  </pic:nvPicPr>
+                  <pic:blipFill>
+                    <a:blip xmlns:r="http://schemas.openxmlformats.org/officeDocument/2006/relationships" r:embed="rId1944180154">
+                      <a:extLst>
+                        <a:ext xmlns:a="http://schemas.openxmlformats.org/drawingml/2006/main" uri="{28A0092B-C50C-407E-A947-70E740481C1C}">
+                          <a14:useLocalDpi xmlns:a14="http://schemas.microsoft.com/office/drawing/2010/main" val="0"/>
+                        </a:ext>
+                      </a:extLst>
+                    </a:blip>
+                    <a:stretch>
+                      <a:fillRect/>
+                    </a:stretch>
+                  </pic:blipFill>
+                  <pic:spPr>
+                    <a:xfrm>
+                      <a:off x="0" y="0"/>
+                      <a:ext cx="6229350" cy="3524250"/>
+                    </a:xfrm>
+                    <a:prstGeom prst="rect">
+                      <a:avLst/>
+                    </a:prstGeom>
+                  </pic:spPr>
+                </pic:pic>
+              </a:graphicData>
+            </a:graphic>
+          </wp:inline>
+        </w:drawing>
       </w:r>
     </w:p>
     <w:p>
       <w:pPr>
         <w:pStyle w:val="Luettelokappale"/>
         <w:ind w:left="720"/>
+      </w:pPr>
+    </w:p>
+    <w:p>
+      <w:pPr>
+        <w:pStyle w:val="Normaali"/>
+        <w:ind/>
+      </w:pPr>
+    </w:p>
+    <w:p>
+      <w:pPr>
+        <w:ind/>
+      </w:pPr>
+      <w:r>
+        <w:br w:type="page"/>
+      </w:r>
+    </w:p>
+    <w:p>
+      <w:pPr>
+        <w:pStyle w:val="Normaali"/>
+        <w:ind/>
       </w:pPr>
       <w:r>
         <w:rPr/>
@@ -2610,25 +2744,34 @@
     <w:p>
       <w:pPr>
         <w:pStyle w:val="Luettelokappale"/>
+        <w:ind w:left="720"/>
+      </w:pPr>
+    </w:p>
+    <w:p>
+      <w:pPr>
+        <w:ind/>
+      </w:pPr>
+      <w:r>
+        <w:br w:type="page"/>
+      </w:r>
+    </w:p>
+    <w:p>
+      <w:pPr>
+        <w:pStyle w:val="Luettelokappale"/>
         <w:numPr>
           <w:ilvl w:val="0"/>
           <w:numId w:val="23"/>
         </w:numPr>
+        <w:ind/>
         <w:rPr/>
       </w:pPr>
       <w:r>
         <w:rPr/>
         <w:t>V2LessonScene</w:t>
       </w:r>
-    </w:p>
-    <w:p>
-      <w:pPr>
-        <w:pStyle w:val="Luettelokappale"/>
-        <w:ind w:left="720"/>
-      </w:pPr>
       <w:r>
         <w:drawing>
-          <wp:inline wp14:editId="13A2CF7F" wp14:anchorId="201B1D5E">
+          <wp:inline wp14:editId="5EF589A5" wp14:anchorId="201B1D5E">
             <wp:extent cx="6000750" cy="3429000"/>
             <wp:effectExtent l="0" t="0" r="0" b="0"/>
             <wp:docPr id="1745865544" name="drawing"/>
@@ -2669,36 +2812,55 @@
           </wp:inline>
         </w:drawing>
       </w:r>
-    </w:p>
-    <w:p>
-      <w:pPr>
-        <w:pStyle w:val="Luettelokappale"/>
-        <w:ind w:left="720"/>
-      </w:pPr>
+      <w:r>
+        <w:drawing>
+          <wp:inline wp14:editId="79556B2C" wp14:anchorId="7A113211">
+            <wp:extent cx="6023987" cy="3352800"/>
+            <wp:effectExtent l="0" t="0" r="0" b="0"/>
+            <wp:docPr id="139207882" name="drawing"/>
+            <wp:cNvGraphicFramePr>
+              <a:graphicFrameLocks noChangeAspect="1"/>
+            </wp:cNvGraphicFramePr>
+            <a:graphic>
+              <a:graphicData xmlns:a="http://schemas.openxmlformats.org/drawingml/2006/main" uri="http://schemas.openxmlformats.org/drawingml/2006/picture">
+                <pic:pic xmlns:pic="http://schemas.openxmlformats.org/drawingml/2006/picture">
+                  <pic:nvPicPr>
+                    <pic:cNvPr id="139207882" name=""/>
+                    <pic:cNvPicPr/>
+                  </pic:nvPicPr>
+                  <pic:blipFill>
+                    <a:blip xmlns:r="http://schemas.openxmlformats.org/officeDocument/2006/relationships" r:embed="rId1754839301">
+                      <a:extLst>
+                        <a:ext uri="{28A0092B-C50C-407E-A947-70E740481C1C}">
+                          <a14:useLocalDpi xmlns:a14="http://schemas.microsoft.com/office/drawing/2010/main"/>
+                        </a:ext>
+                      </a:extLst>
+                    </a:blip>
+                    <a:stretch>
+                      <a:fillRect/>
+                    </a:stretch>
+                  </pic:blipFill>
+                  <pic:spPr>
+                    <a:xfrm rot="0">
+                      <a:off x="0" y="0"/>
+                      <a:ext cx="6023987" cy="3352800"/>
+                    </a:xfrm>
+                    <a:prstGeom prst="rect">
+                      <a:avLst/>
+                    </a:prstGeom>
+                  </pic:spPr>
+                </pic:pic>
+              </a:graphicData>
+            </a:graphic>
+          </wp:inline>
+        </w:drawing>
+      </w:r>
       <w:r>
         <w:br/>
       </w:r>
-    </w:p>
-    <w:p>
-      <w:pPr>
-        <w:pStyle w:val="Luettelokappale"/>
-        <w:ind w:left="720"/>
-      </w:pPr>
-    </w:p>
-    <w:p>
-      <w:pPr>
-        <w:pStyle w:val="Luettelokappale"/>
-        <w:ind w:left="720"/>
-      </w:pPr>
-    </w:p>
-    <w:p>
-      <w:pPr>
-        <w:pStyle w:val="Normaali"/>
-        <w:ind w:left="0"/>
-      </w:pPr>
       <w:r>
         <w:drawing>
-          <wp:inline wp14:editId="1186EC4D" wp14:anchorId="35695E33">
+          <wp:inline wp14:editId="140CD910" wp14:anchorId="35695E33">
             <wp:extent cx="6229350" cy="3543300"/>
             <wp:effectExtent l="0" t="0" r="0" b="0"/>
             <wp:docPr id="1438846163" name="drawing"/>
@@ -2741,50 +2903,7 @@
       </w:r>
       <w:r>
         <w:drawing>
-          <wp:inline wp14:editId="0B7AF1E6" wp14:anchorId="712377A9">
-            <wp:extent cx="6229350" cy="3524250"/>
-            <wp:effectExtent l="0" t="0" r="0" b="0"/>
-            <wp:docPr id="1123076308" name="drawing"/>
-            <wp:cNvGraphicFramePr>
-              <a:graphicFrameLocks noChangeAspect="1"/>
-            </wp:cNvGraphicFramePr>
-            <a:graphic>
-              <a:graphicData xmlns:a="http://schemas.openxmlformats.org/drawingml/2006/main" uri="http://schemas.openxmlformats.org/drawingml/2006/picture">
-                <pic:pic xmlns:pic="http://schemas.openxmlformats.org/drawingml/2006/picture">
-                  <pic:nvPicPr>
-                    <pic:cNvPr id="1123076308" name=""/>
-                    <pic:cNvPicPr/>
-                  </pic:nvPicPr>
-                  <pic:blipFill>
-                    <a:blip xmlns:r="http://schemas.openxmlformats.org/officeDocument/2006/relationships" r:embed="rId294480718">
-                      <a:extLst>
-                        <a:ext xmlns:a="http://schemas.openxmlformats.org/drawingml/2006/main" uri="{28A0092B-C50C-407E-A947-70E740481C1C}">
-                          <a14:useLocalDpi xmlns:a14="http://schemas.microsoft.com/office/drawing/2010/main" val="0"/>
-                        </a:ext>
-                      </a:extLst>
-                    </a:blip>
-                    <a:stretch>
-                      <a:fillRect/>
-                    </a:stretch>
-                  </pic:blipFill>
-                  <pic:spPr>
-                    <a:xfrm>
-                      <a:off x="0" y="0"/>
-                      <a:ext cx="6229350" cy="3524250"/>
-                    </a:xfrm>
-                    <a:prstGeom prst="rect">
-                      <a:avLst/>
-                    </a:prstGeom>
-                  </pic:spPr>
-                </pic:pic>
-              </a:graphicData>
-            </a:graphic>
-          </wp:inline>
-        </w:drawing>
-      </w:r>
-      <w:r>
-        <w:drawing>
-          <wp:inline wp14:editId="354A4C79" wp14:anchorId="70F026F7">
+          <wp:inline wp14:editId="7A171FC3" wp14:anchorId="70F026F7">
             <wp:extent cx="6229350" cy="3524250"/>
             <wp:effectExtent l="0" t="0" r="0" b="0"/>
             <wp:docPr id="1797636433" name="drawing"/>
@@ -2855,10 +2974,10 @@
       </w:pPr>
       <w:r>
         <w:drawing>
-          <wp:inline wp14:editId="427066C8" wp14:anchorId="7181EF13">
-            <wp:extent cx="5892813" cy="7724775"/>
+          <wp:inline wp14:editId="782EEF99" wp14:anchorId="29BB69BC">
+            <wp:extent cx="5958208" cy="7810500"/>
             <wp:effectExtent l="0" t="0" r="0" b="0"/>
-            <wp:docPr id="1982504002" name="drawing"/>
+            <wp:docPr id="409502673" name="drawing"/>
             <wp:cNvGraphicFramePr>
               <a:graphicFrameLocks noChangeAspect="1"/>
             </wp:cNvGraphicFramePr>
@@ -2866,11 +2985,11 @@
               <a:graphicData xmlns:a="http://schemas.openxmlformats.org/drawingml/2006/main" uri="http://schemas.openxmlformats.org/drawingml/2006/picture">
                 <pic:pic xmlns:pic="http://schemas.openxmlformats.org/drawingml/2006/picture">
                   <pic:nvPicPr>
-                    <pic:cNvPr id="1157144998" name="Picture 1157144998"/>
+                    <pic:cNvPr id="409502673" name="Picture 409502673"/>
                     <pic:cNvPicPr/>
                   </pic:nvPicPr>
                   <pic:blipFill>
-                    <a:blip xmlns:r="http://schemas.openxmlformats.org/officeDocument/2006/relationships" r:embed="rId1108861903">
+                    <a:blip xmlns:r="http://schemas.openxmlformats.org/officeDocument/2006/relationships" r:embed="rId773420078">
                       <a:extLst>
                         <a:ext uri="{28A0092B-C50C-407E-A947-70E740481C1C}">
                           <a14:useLocalDpi xmlns:a14="http://schemas.microsoft.com/office/drawing/2010/main"/>
@@ -2884,7 +3003,7 @@
                   <pic:spPr>
                     <a:xfrm rot="0">
                       <a:off x="0" y="0"/>
-                      <a:ext cx="5892813" cy="7724775"/>
+                      <a:ext cx="5958208" cy="7810500"/>
                     </a:xfrm>
                     <a:prstGeom prst="rect">
                       <a:avLst/>
@@ -2962,7 +3081,7 @@
       </w:pPr>
       <w:r>
         <w:drawing>
-          <wp:inline wp14:editId="74ECCFF0" wp14:anchorId="15F5C8FD">
+          <wp:inline wp14:editId="683AC54E" wp14:anchorId="15F5C8FD">
             <wp:extent cx="6229350" cy="3514725"/>
             <wp:effectExtent l="0" t="0" r="0" b="0"/>
             <wp:docPr id="1370638529" name="drawing"/>
@@ -3003,7 +3122,2547 @@
           </wp:inline>
         </w:drawing>
       </w:r>
-    </w:p>
+      <w:r>
+        <w:rPr>
+          <w:rFonts w:ascii="Calibri" w:hAnsi="Calibri" w:eastAsia="Calibri" w:cs="Calibri" w:asciiTheme="minorAscii" w:hAnsiTheme="minorAscii" w:eastAsiaTheme="minorEastAsia" w:cstheme="minorBidi"/>
+          <w:b w:val="0"/>
+          <w:bCs w:val="0"/>
+          <w:i w:val="0"/>
+          <w:iCs w:val="0"/>
+          <w:noProof w:val="0"/>
+          <w:color w:val="auto"/>
+          <w:sz w:val="20"/>
+          <w:szCs w:val="20"/>
+          <w:lang w:val="fi-FI" w:eastAsia="fi-FI" w:bidi="ar-SA"/>
+        </w:rPr>
+        <w:t>Frontend</w:t>
+      </w:r>
+      <w:r>
+        <w:rPr>
+          <w:rFonts w:ascii="Calibri" w:hAnsi="Calibri" w:eastAsia="Calibri" w:cs="Calibri" w:asciiTheme="minorAscii" w:hAnsiTheme="minorAscii" w:eastAsiaTheme="minorEastAsia" w:cstheme="minorBidi"/>
+          <w:b w:val="0"/>
+          <w:bCs w:val="0"/>
+          <w:i w:val="0"/>
+          <w:iCs w:val="0"/>
+          <w:noProof w:val="0"/>
+          <w:color w:val="auto"/>
+          <w:sz w:val="20"/>
+          <w:szCs w:val="20"/>
+          <w:lang w:val="fi-FI" w:eastAsia="fi-FI" w:bidi="ar-SA"/>
+        </w:rPr>
+        <w:t xml:space="preserve"> </w:t>
+      </w:r>
+      <w:r>
+        <w:rPr>
+          <w:rFonts w:ascii="Calibri" w:hAnsi="Calibri" w:eastAsia="Calibri" w:cs="Calibri" w:asciiTheme="minorAscii" w:hAnsiTheme="minorAscii" w:eastAsiaTheme="minorEastAsia" w:cstheme="minorBidi"/>
+          <w:b w:val="0"/>
+          <w:bCs w:val="0"/>
+          <w:i w:val="0"/>
+          <w:iCs w:val="0"/>
+          <w:noProof w:val="0"/>
+          <w:color w:val="auto"/>
+          <w:sz w:val="20"/>
+          <w:szCs w:val="20"/>
+          <w:lang w:val="fi-FI" w:eastAsia="fi-FI" w:bidi="ar-SA"/>
+        </w:rPr>
+        <w:t>architecture</w:t>
+      </w:r>
+      <w:r>
+        <w:rPr>
+          <w:rFonts w:ascii="Calibri" w:hAnsi="Calibri" w:eastAsia="Calibri" w:cs="Calibri" w:asciiTheme="minorAscii" w:hAnsiTheme="minorAscii" w:eastAsiaTheme="minorEastAsia" w:cstheme="minorBidi"/>
+          <w:b w:val="0"/>
+          <w:bCs w:val="0"/>
+          <w:i w:val="0"/>
+          <w:iCs w:val="0"/>
+          <w:noProof w:val="0"/>
+          <w:color w:val="auto"/>
+          <w:sz w:val="20"/>
+          <w:szCs w:val="20"/>
+          <w:lang w:val="fi-FI" w:eastAsia="fi-FI" w:bidi="ar-SA"/>
+        </w:rPr>
+        <w:t>:</w:t>
+      </w:r>
+    </w:p>
+    <w:p>
+      <w:pPr>
+        <w:pStyle w:val="NormaaliWWW"/>
+        <w:spacing w:beforeAutospacing="on" w:afterAutospacing="on" w:line="240" w:lineRule="auto"/>
+        <w:ind w:left="90" w:right="0" w:firstLine="270"/>
+      </w:pPr>
+      <w:r>
+        <w:drawing>
+          <wp:inline wp14:editId="5B729438" wp14:anchorId="4C46BD52">
+            <wp:extent cx="4030924" cy="5095087"/>
+            <wp:effectExtent l="0" t="0" r="0" b="0"/>
+            <wp:docPr id="1615848752" name="drawing"/>
+            <wp:cNvGraphicFramePr>
+              <a:graphicFrameLocks noChangeAspect="1"/>
+            </wp:cNvGraphicFramePr>
+            <a:graphic>
+              <a:graphicData xmlns:a="http://schemas.openxmlformats.org/drawingml/2006/main" uri="http://schemas.openxmlformats.org/drawingml/2006/picture">
+                <pic:pic xmlns:pic="http://schemas.openxmlformats.org/drawingml/2006/picture">
+                  <pic:nvPicPr>
+                    <pic:cNvPr id="1615848752" name="Picture 1615848752"/>
+                    <pic:cNvPicPr/>
+                  </pic:nvPicPr>
+                  <pic:blipFill>
+                    <a:blip xmlns:r="http://schemas.openxmlformats.org/officeDocument/2006/relationships" r:embed="rId438203258">
+                      <a:extLst>
+                        <a:ext uri="{28A0092B-C50C-407E-A947-70E740481C1C}">
+                          <a14:useLocalDpi xmlns:a14="http://schemas.microsoft.com/office/drawing/2010/main"/>
+                        </a:ext>
+                      </a:extLst>
+                    </a:blip>
+                    <a:stretch>
+                      <a:fillRect/>
+                    </a:stretch>
+                  </pic:blipFill>
+                  <pic:spPr>
+                    <a:xfrm rot="0">
+                      <a:off x="0" y="0"/>
+                      <a:ext cx="4030924" cy="5095087"/>
+                    </a:xfrm>
+                    <a:prstGeom prst="rect">
+                      <a:avLst/>
+                    </a:prstGeom>
+                  </pic:spPr>
+                </pic:pic>
+              </a:graphicData>
+            </a:graphic>
+          </wp:inline>
+        </w:drawing>
+      </w:r>
+    </w:p>
+    <w:p>
+      <w:pPr/>
+      <w:r>
+        <w:br w:type="page"/>
+      </w:r>
+    </w:p>
+    <w:p>
+      <w:pPr>
+        <w:pStyle w:val="NormaaliWWW"/>
+        <w:spacing w:beforeAutospacing="on" w:afterAutospacing="on" w:line="240" w:lineRule="auto"/>
+        <w:ind w:left="90" w:right="0"/>
+        <w:rPr>
+          <w:rFonts w:ascii="Calibri" w:hAnsi="Calibri" w:eastAsia="Calibri" w:cs="Calibri"/>
+          <w:b w:val="0"/>
+          <w:bCs w:val="0"/>
+          <w:i w:val="0"/>
+          <w:iCs w:val="0"/>
+          <w:noProof w:val="0"/>
+          <w:sz w:val="20"/>
+          <w:szCs w:val="20"/>
+          <w:lang w:val="fi-FI"/>
+        </w:rPr>
+      </w:pPr>
+      <w:r>
+        <w:rPr>
+          <w:rFonts w:ascii="Calibri" w:hAnsi="Calibri" w:eastAsia="Calibri" w:cs="Calibri" w:asciiTheme="minorAscii" w:hAnsiTheme="minorAscii" w:eastAsiaTheme="minorEastAsia" w:cstheme="minorBidi"/>
+          <w:b w:val="0"/>
+          <w:bCs w:val="0"/>
+          <w:i w:val="0"/>
+          <w:iCs w:val="0"/>
+          <w:noProof w:val="0"/>
+          <w:color w:val="auto"/>
+          <w:sz w:val="20"/>
+          <w:szCs w:val="20"/>
+          <w:lang w:val="fi-FI" w:eastAsia="fi-FI" w:bidi="ar-SA"/>
+        </w:rPr>
+        <w:t>Backend</w:t>
+      </w:r>
+      <w:r>
+        <w:rPr>
+          <w:rFonts w:ascii="Calibri" w:hAnsi="Calibri" w:eastAsia="Calibri" w:cs="Calibri" w:asciiTheme="minorAscii" w:hAnsiTheme="minorAscii" w:eastAsiaTheme="minorEastAsia" w:cstheme="minorBidi"/>
+          <w:b w:val="0"/>
+          <w:bCs w:val="0"/>
+          <w:i w:val="0"/>
+          <w:iCs w:val="0"/>
+          <w:noProof w:val="0"/>
+          <w:color w:val="auto"/>
+          <w:sz w:val="20"/>
+          <w:szCs w:val="20"/>
+          <w:lang w:val="fi-FI" w:eastAsia="fi-FI" w:bidi="ar-SA"/>
+        </w:rPr>
+        <w:t xml:space="preserve"> </w:t>
+      </w:r>
+      <w:r>
+        <w:rPr>
+          <w:rFonts w:ascii="Calibri" w:hAnsi="Calibri" w:eastAsia="Calibri" w:cs="Calibri" w:asciiTheme="minorAscii" w:hAnsiTheme="minorAscii" w:eastAsiaTheme="minorEastAsia" w:cstheme="minorBidi"/>
+          <w:b w:val="0"/>
+          <w:bCs w:val="0"/>
+          <w:i w:val="0"/>
+          <w:iCs w:val="0"/>
+          <w:noProof w:val="0"/>
+          <w:color w:val="auto"/>
+          <w:sz w:val="20"/>
+          <w:szCs w:val="20"/>
+          <w:lang w:val="fi-FI" w:eastAsia="fi-FI" w:bidi="ar-SA"/>
+        </w:rPr>
+        <w:t>architecture</w:t>
+      </w:r>
+      <w:r>
+        <w:rPr>
+          <w:rFonts w:ascii="Calibri" w:hAnsi="Calibri" w:eastAsia="Calibri" w:cs="Calibri" w:asciiTheme="minorAscii" w:hAnsiTheme="minorAscii" w:eastAsiaTheme="minorEastAsia" w:cstheme="minorBidi"/>
+          <w:b w:val="0"/>
+          <w:bCs w:val="0"/>
+          <w:i w:val="0"/>
+          <w:iCs w:val="0"/>
+          <w:noProof w:val="0"/>
+          <w:color w:val="auto"/>
+          <w:sz w:val="20"/>
+          <w:szCs w:val="20"/>
+          <w:lang w:val="fi-FI" w:eastAsia="fi-FI" w:bidi="ar-SA"/>
+        </w:rPr>
+        <w:t>:</w:t>
+      </w:r>
+    </w:p>
+    <w:p>
+      <w:pPr>
+        <w:pStyle w:val="NormaaliWWW"/>
+        <w:spacing w:beforeAutospacing="on" w:afterAutospacing="on" w:line="240" w:lineRule="auto"/>
+        <w:ind w:left="90" w:right="0"/>
+      </w:pPr>
+      <w:r>
+        <w:drawing>
+          <wp:inline wp14:editId="15D2293A" wp14:anchorId="71C89CC9">
+            <wp:extent cx="4689937" cy="4371975"/>
+            <wp:effectExtent l="0" t="0" r="0" b="0"/>
+            <wp:docPr id="1313880852" name="drawing"/>
+            <wp:cNvGraphicFramePr>
+              <a:graphicFrameLocks noChangeAspect="1"/>
+            </wp:cNvGraphicFramePr>
+            <a:graphic>
+              <a:graphicData xmlns:a="http://schemas.openxmlformats.org/drawingml/2006/main" uri="http://schemas.openxmlformats.org/drawingml/2006/picture">
+                <pic:pic xmlns:pic="http://schemas.openxmlformats.org/drawingml/2006/picture">
+                  <pic:nvPicPr>
+                    <pic:cNvPr id="1313880852" name="Picture 1313880852"/>
+                    <pic:cNvPicPr/>
+                  </pic:nvPicPr>
+                  <pic:blipFill>
+                    <a:blip xmlns:r="http://schemas.openxmlformats.org/officeDocument/2006/relationships" r:embed="rId1647480284">
+                      <a:extLst>
+                        <a:ext uri="{28A0092B-C50C-407E-A947-70E740481C1C}">
+                          <a14:useLocalDpi xmlns:a14="http://schemas.microsoft.com/office/drawing/2010/main"/>
+                        </a:ext>
+                      </a:extLst>
+                    </a:blip>
+                    <a:stretch>
+                      <a:fillRect/>
+                    </a:stretch>
+                  </pic:blipFill>
+                  <pic:spPr>
+                    <a:xfrm rot="0">
+                      <a:off x="0" y="0"/>
+                      <a:ext cx="4689937" cy="4371975"/>
+                    </a:xfrm>
+                    <a:prstGeom prst="rect">
+                      <a:avLst/>
+                    </a:prstGeom>
+                  </pic:spPr>
+                </pic:pic>
+              </a:graphicData>
+            </a:graphic>
+          </wp:inline>
+        </w:drawing>
+      </w:r>
+    </w:p>
+    <w:p>
+      <w:pPr>
+        <w:pStyle w:val="NormaaliWWW"/>
+        <w:spacing w:beforeAutospacing="on" w:afterAutospacing="on" w:line="240" w:lineRule="auto"/>
+        <w:ind w:left="90" w:right="0"/>
+        <w:rPr>
+          <w:rFonts w:ascii="Calibri" w:hAnsi="Calibri" w:eastAsia="Calibri" w:cs="Calibri"/>
+          <w:b w:val="0"/>
+          <w:bCs w:val="0"/>
+          <w:i w:val="0"/>
+          <w:iCs w:val="0"/>
+          <w:noProof w:val="0"/>
+          <w:sz w:val="20"/>
+          <w:szCs w:val="20"/>
+          <w:lang w:val="fi-FI"/>
+        </w:rPr>
+      </w:pPr>
+      <w:r>
+        <w:rPr>
+          <w:rFonts w:ascii="Calibri" w:hAnsi="Calibri" w:eastAsia="Calibri" w:cs="Calibri"/>
+          <w:b w:val="0"/>
+          <w:bCs w:val="0"/>
+          <w:i w:val="0"/>
+          <w:iCs w:val="0"/>
+          <w:noProof w:val="0"/>
+          <w:sz w:val="20"/>
+          <w:szCs w:val="20"/>
+          <w:lang w:val="fi-FI"/>
+        </w:rPr>
+        <w:t>Sekvenssikaavio:</w:t>
+      </w:r>
+    </w:p>
+    <w:p>
+      <w:pPr>
+        <w:pStyle w:val="Normaali"/>
+        <w:ind w:left="90"/>
+      </w:pPr>
+      <w:r>
+        <w:drawing>
+          <wp:inline wp14:editId="1B0C61E5" wp14:anchorId="777A7269">
+            <wp:extent cx="6296025" cy="3428821"/>
+            <wp:effectExtent l="0" t="0" r="0" b="0"/>
+            <wp:docPr id="1368323673" name="drawing"/>
+            <wp:cNvGraphicFramePr>
+              <a:graphicFrameLocks noChangeAspect="1"/>
+            </wp:cNvGraphicFramePr>
+            <a:graphic>
+              <a:graphicData xmlns:a="http://schemas.openxmlformats.org/drawingml/2006/main" uri="http://schemas.openxmlformats.org/drawingml/2006/picture">
+                <pic:pic xmlns:pic="http://schemas.openxmlformats.org/drawingml/2006/picture">
+                  <pic:nvPicPr>
+                    <pic:cNvPr id="1368323673" name="Picture 1368323673"/>
+                    <pic:cNvPicPr/>
+                  </pic:nvPicPr>
+                  <pic:blipFill>
+                    <a:blip xmlns:r="http://schemas.openxmlformats.org/officeDocument/2006/relationships" r:embed="rId251390267">
+                      <a:extLst>
+                        <a:ext uri="{28A0092B-C50C-407E-A947-70E740481C1C}">
+                          <a14:useLocalDpi xmlns:a14="http://schemas.microsoft.com/office/drawing/2010/main"/>
+                        </a:ext>
+                      </a:extLst>
+                    </a:blip>
+                    <a:stretch>
+                      <a:fillRect/>
+                    </a:stretch>
+                  </pic:blipFill>
+                  <pic:spPr>
+                    <a:xfrm rot="0">
+                      <a:off x="0" y="0"/>
+                      <a:ext cx="6296025" cy="3428821"/>
+                    </a:xfrm>
+                    <a:prstGeom prst="rect">
+                      <a:avLst/>
+                    </a:prstGeom>
+                  </pic:spPr>
+                </pic:pic>
+              </a:graphicData>
+            </a:graphic>
+          </wp:inline>
+        </w:drawing>
+      </w:r>
+    </w:p>
+    <w:p>
+      <w:pPr>
+        <w:pStyle w:val="NormaaliWWW"/>
+        <w:spacing w:beforeAutospacing="on" w:afterAutospacing="on" w:line="240" w:lineRule="auto"/>
+        <w:ind w:left="90" w:right="0"/>
+        <w:rPr>
+          <w:rFonts w:ascii="Calibri" w:hAnsi="Calibri" w:eastAsia="Calibri" w:cs="Calibri"/>
+          <w:b w:val="0"/>
+          <w:bCs w:val="0"/>
+          <w:i w:val="0"/>
+          <w:iCs w:val="0"/>
+          <w:noProof w:val="0"/>
+          <w:sz w:val="20"/>
+          <w:szCs w:val="20"/>
+          <w:lang w:val="fi-FI"/>
+        </w:rPr>
+      </w:pPr>
+    </w:p>
+    <w:p>
+      <w:pPr/>
+      <w:r>
+        <w:br w:type="page"/>
+      </w:r>
+    </w:p>
+    <w:p>
+      <w:pPr>
+        <w:pStyle w:val="NormaaliWWW"/>
+        <w:spacing w:beforeAutospacing="on" w:afterAutospacing="on" w:line="240" w:lineRule="auto"/>
+        <w:ind w:left="90" w:right="0"/>
+        <w:rPr>
+          <w:rFonts w:ascii="Calibri" w:hAnsi="Calibri" w:eastAsia="Calibri" w:cs="Calibri"/>
+          <w:b w:val="0"/>
+          <w:bCs w:val="0"/>
+          <w:i w:val="0"/>
+          <w:iCs w:val="0"/>
+          <w:noProof w:val="0"/>
+          <w:sz w:val="20"/>
+          <w:szCs w:val="20"/>
+          <w:lang w:val="fi-FI"/>
+        </w:rPr>
+      </w:pPr>
+      <w:r>
+        <w:rPr>
+          <w:rFonts w:ascii="Calibri" w:hAnsi="Calibri" w:eastAsia="Calibri" w:cs="Calibri"/>
+          <w:b w:val="0"/>
+          <w:bCs w:val="0"/>
+          <w:i w:val="0"/>
+          <w:iCs w:val="0"/>
+          <w:noProof w:val="0"/>
+          <w:sz w:val="20"/>
+          <w:szCs w:val="20"/>
+          <w:lang w:val="fi-FI"/>
+        </w:rPr>
+        <w:t>REST API:</w:t>
+      </w:r>
+    </w:p>
+    <w:tbl>
+      <w:tblPr>
+        <w:tblStyle w:val="TaulukkoRuudukko"/>
+        <w:bidiVisual w:val="0"/>
+        <w:tblW w:w="0" w:type="auto"/>
+        <w:tblBorders>
+          <w:top w:val="single" w:sz="6"/>
+          <w:left w:val="single" w:sz="6"/>
+          <w:bottom w:val="single" w:sz="6"/>
+          <w:right w:val="single" w:sz="6"/>
+        </w:tblBorders>
+        <w:tblLook w:val="06A0" w:firstRow="1" w:lastRow="0" w:firstColumn="1" w:lastColumn="0" w:noHBand="1" w:noVBand="1"/>
+      </w:tblPr>
+      <w:tblGrid>
+        <w:gridCol w:w="2415"/>
+        <w:gridCol w:w="7185"/>
+      </w:tblGrid>
+      <w:tr>
+        <w:trPr>
+          <w:trHeight w:val="300"/>
+        </w:trPr>
+        <w:tc>
+          <w:tcPr>
+            <w:tcW w:w="2415" w:type="dxa"/>
+            <w:tcMar>
+              <w:left w:w="105" w:type="dxa"/>
+              <w:right w:w="105" w:type="dxa"/>
+            </w:tcMar>
+            <w:vAlign w:val="top"/>
+          </w:tcPr>
+          <w:p>
+            <w:pPr>
+              <w:ind w:left="90" w:right="0"/>
+              <w:rPr>
+                <w:rFonts w:ascii="Calibri" w:hAnsi="Calibri" w:eastAsia="Calibri" w:cs="Calibri"/>
+                <w:b w:val="0"/>
+                <w:bCs w:val="0"/>
+                <w:i w:val="0"/>
+                <w:iCs w:val="0"/>
+                <w:color w:val="24292E"/>
+                <w:sz w:val="24"/>
+                <w:szCs w:val="24"/>
+              </w:rPr>
+            </w:pPr>
+            <w:r>
+              <w:rPr>
+                <w:rFonts w:ascii="Calibri" w:hAnsi="Calibri" w:eastAsia="Calibri" w:cs="Calibri"/>
+                <w:b w:val="1"/>
+                <w:bCs w:val="1"/>
+                <w:i w:val="0"/>
+                <w:iCs w:val="0"/>
+                <w:color w:val="24292E"/>
+                <w:sz w:val="24"/>
+                <w:szCs w:val="24"/>
+                <w:lang w:val="fi-FI"/>
+              </w:rPr>
+              <w:t>Description</w:t>
+            </w:r>
+          </w:p>
+        </w:tc>
+        <w:tc>
+          <w:tcPr>
+            <w:tcW w:w="7185" w:type="dxa"/>
+            <w:tcMar>
+              <w:left w:w="105" w:type="dxa"/>
+              <w:right w:w="105" w:type="dxa"/>
+            </w:tcMar>
+            <w:vAlign w:val="top"/>
+          </w:tcPr>
+          <w:p>
+            <w:pPr>
+              <w:spacing w:after="200" w:line="276" w:lineRule="auto"/>
+              <w:ind w:left="90" w:right="0"/>
+              <w:rPr>
+                <w:rFonts w:ascii="Calibri" w:hAnsi="Calibri" w:eastAsia="Calibri" w:cs="Calibri"/>
+                <w:b w:val="0"/>
+                <w:bCs w:val="0"/>
+                <w:i w:val="0"/>
+                <w:iCs w:val="0"/>
+                <w:sz w:val="21"/>
+                <w:szCs w:val="21"/>
+              </w:rPr>
+            </w:pPr>
+            <w:r>
+              <w:rPr>
+                <w:rFonts w:ascii="Calibri" w:hAnsi="Calibri" w:eastAsia="Calibri" w:cs="Calibri"/>
+                <w:b w:val="0"/>
+                <w:bCs w:val="0"/>
+                <w:i w:val="0"/>
+                <w:iCs w:val="0"/>
+                <w:sz w:val="21"/>
+                <w:szCs w:val="21"/>
+                <w:lang w:val="en-US"/>
+              </w:rPr>
+              <w:t>Get</w:t>
+            </w:r>
+            <w:r>
+              <w:rPr>
+                <w:rFonts w:ascii="Calibri" w:hAnsi="Calibri" w:eastAsia="Calibri" w:cs="Calibri"/>
+                <w:b w:val="0"/>
+                <w:bCs w:val="0"/>
+                <w:i w:val="0"/>
+                <w:iCs w:val="0"/>
+                <w:sz w:val="21"/>
+                <w:szCs w:val="21"/>
+                <w:lang w:val="en-US"/>
+              </w:rPr>
+              <w:t xml:space="preserve"> images, words and sounds from database and show on MatchGameScene</w:t>
+            </w:r>
+            <w:r>
+              <w:rPr>
+                <w:rFonts w:ascii="Calibri" w:hAnsi="Calibri" w:eastAsia="Calibri" w:cs="Calibri"/>
+                <w:b w:val="0"/>
+                <w:bCs w:val="0"/>
+                <w:i w:val="0"/>
+                <w:iCs w:val="0"/>
+                <w:sz w:val="21"/>
+                <w:szCs w:val="21"/>
+                <w:lang w:val="en-US"/>
+              </w:rPr>
+              <w:t>.</w:t>
+            </w:r>
+          </w:p>
+        </w:tc>
+      </w:tr>
+      <w:tr>
+        <w:trPr>
+          <w:trHeight w:val="300"/>
+        </w:trPr>
+        <w:tc>
+          <w:tcPr>
+            <w:tcW w:w="2415" w:type="dxa"/>
+            <w:tcMar>
+              <w:left w:w="105" w:type="dxa"/>
+              <w:right w:w="105" w:type="dxa"/>
+            </w:tcMar>
+            <w:vAlign w:val="top"/>
+          </w:tcPr>
+          <w:p>
+            <w:pPr>
+              <w:spacing w:after="200" w:line="276" w:lineRule="auto"/>
+              <w:ind w:left="90" w:right="0"/>
+              <w:rPr>
+                <w:rFonts w:ascii="Calibri" w:hAnsi="Calibri" w:eastAsia="Calibri" w:cs="Calibri"/>
+                <w:b w:val="0"/>
+                <w:bCs w:val="0"/>
+                <w:i w:val="0"/>
+                <w:iCs w:val="0"/>
+                <w:color w:val="24292E"/>
+                <w:sz w:val="24"/>
+                <w:szCs w:val="24"/>
+              </w:rPr>
+            </w:pPr>
+            <w:r>
+              <w:rPr>
+                <w:rFonts w:ascii="Calibri" w:hAnsi="Calibri" w:eastAsia="Calibri" w:cs="Calibri"/>
+                <w:b w:val="1"/>
+                <w:bCs w:val="1"/>
+                <w:i w:val="0"/>
+                <w:iCs w:val="0"/>
+                <w:color w:val="24292E"/>
+                <w:sz w:val="24"/>
+                <w:szCs w:val="24"/>
+                <w:lang w:val="fi-FI"/>
+              </w:rPr>
+              <w:t>URL</w:t>
+            </w:r>
+          </w:p>
+        </w:tc>
+        <w:tc>
+          <w:tcPr>
+            <w:tcW w:w="7185" w:type="dxa"/>
+            <w:tcMar>
+              <w:left w:w="105" w:type="dxa"/>
+              <w:right w:w="105" w:type="dxa"/>
+            </w:tcMar>
+            <w:vAlign w:val="top"/>
+          </w:tcPr>
+          <w:p>
+            <w:pPr>
+              <w:spacing w:after="200" w:line="276" w:lineRule="auto"/>
+              <w:ind w:left="90" w:right="0"/>
+              <w:rPr>
+                <w:rFonts w:ascii="Calibri" w:hAnsi="Calibri" w:eastAsia="Calibri" w:cs="Calibri"/>
+                <w:b w:val="0"/>
+                <w:bCs w:val="0"/>
+                <w:i w:val="0"/>
+                <w:iCs w:val="0"/>
+                <w:color w:val="24292E"/>
+                <w:sz w:val="21"/>
+                <w:szCs w:val="21"/>
+                <w:lang w:val="fi-FI"/>
+              </w:rPr>
+            </w:pPr>
+            <w:r>
+              <w:rPr>
+                <w:rFonts w:ascii="Calibri" w:hAnsi="Calibri" w:eastAsia="Calibri" w:cs="Calibri"/>
+                <w:b w:val="0"/>
+                <w:bCs w:val="0"/>
+                <w:i w:val="0"/>
+                <w:iCs w:val="0"/>
+                <w:color w:val="24292E"/>
+                <w:sz w:val="21"/>
+                <w:szCs w:val="21"/>
+                <w:lang w:val="fi-FI"/>
+              </w:rPr>
+              <w:t>/</w:t>
+            </w:r>
+            <w:r>
+              <w:rPr>
+                <w:rFonts w:ascii="Calibri" w:hAnsi="Calibri" w:eastAsia="Calibri" w:cs="Calibri"/>
+                <w:b w:val="0"/>
+                <w:bCs w:val="0"/>
+                <w:i w:val="0"/>
+                <w:iCs w:val="0"/>
+                <w:color w:val="24292E"/>
+                <w:sz w:val="21"/>
+                <w:szCs w:val="21"/>
+                <w:lang w:val="fi-FI"/>
+              </w:rPr>
+              <w:t>matc</w:t>
+            </w:r>
+            <w:r>
+              <w:rPr>
+                <w:rFonts w:ascii="Calibri" w:hAnsi="Calibri" w:eastAsia="Calibri" w:cs="Calibri"/>
+                <w:b w:val="0"/>
+                <w:bCs w:val="0"/>
+                <w:i w:val="0"/>
+                <w:iCs w:val="0"/>
+                <w:color w:val="24292E"/>
+                <w:sz w:val="21"/>
+                <w:szCs w:val="21"/>
+                <w:lang w:val="fi-FI"/>
+              </w:rPr>
+              <w:t>h</w:t>
+            </w:r>
+            <w:r>
+              <w:rPr>
+                <w:rFonts w:ascii="Calibri" w:hAnsi="Calibri" w:eastAsia="Calibri" w:cs="Calibri"/>
+                <w:b w:val="0"/>
+                <w:bCs w:val="0"/>
+                <w:i w:val="0"/>
+                <w:iCs w:val="0"/>
+                <w:color w:val="24292E"/>
+                <w:sz w:val="21"/>
+                <w:szCs w:val="21"/>
+                <w:lang w:val="fi-FI"/>
+              </w:rPr>
+              <w:t>-game</w:t>
+            </w:r>
+            <w:r>
+              <w:rPr>
+                <w:rFonts w:ascii="Calibri" w:hAnsi="Calibri" w:eastAsia="Calibri" w:cs="Calibri"/>
+                <w:b w:val="0"/>
+                <w:bCs w:val="0"/>
+                <w:i w:val="0"/>
+                <w:iCs w:val="0"/>
+                <w:color w:val="24292E"/>
+                <w:sz w:val="21"/>
+                <w:szCs w:val="21"/>
+                <w:lang w:val="fi-FI"/>
+              </w:rPr>
+              <w:t>/</w:t>
+            </w:r>
+            <w:r>
+              <w:rPr>
+                <w:rFonts w:ascii="Calibri" w:hAnsi="Calibri" w:eastAsia="Calibri" w:cs="Calibri"/>
+                <w:b w:val="0"/>
+                <w:bCs w:val="0"/>
+                <w:i w:val="0"/>
+                <w:iCs w:val="0"/>
+                <w:color w:val="24292E"/>
+                <w:sz w:val="21"/>
+                <w:szCs w:val="21"/>
+                <w:lang w:val="fi-FI"/>
+              </w:rPr>
+              <w:t>lang</w:t>
+            </w:r>
+            <w:r>
+              <w:rPr>
+                <w:rFonts w:ascii="Calibri" w:hAnsi="Calibri" w:eastAsia="Calibri" w:cs="Calibri"/>
+                <w:b w:val="0"/>
+                <w:bCs w:val="0"/>
+                <w:i w:val="0"/>
+                <w:iCs w:val="0"/>
+                <w:color w:val="24292E"/>
+                <w:sz w:val="21"/>
+                <w:szCs w:val="21"/>
+                <w:lang w:val="fi-FI"/>
+              </w:rPr>
+              <w:t>/</w:t>
+            </w:r>
+            <w:r>
+              <w:rPr>
+                <w:rFonts w:ascii="Calibri" w:hAnsi="Calibri" w:eastAsia="Calibri" w:cs="Calibri"/>
+                <w:b w:val="0"/>
+                <w:bCs w:val="0"/>
+                <w:i w:val="0"/>
+                <w:iCs w:val="0"/>
+                <w:color w:val="24292E"/>
+                <w:sz w:val="21"/>
+                <w:szCs w:val="21"/>
+                <w:lang w:val="fi-FI"/>
+              </w:rPr>
+              <w:t>fi</w:t>
+            </w:r>
+          </w:p>
+        </w:tc>
+      </w:tr>
+      <w:tr>
+        <w:trPr>
+          <w:trHeight w:val="300"/>
+        </w:trPr>
+        <w:tc>
+          <w:tcPr>
+            <w:tcW w:w="2415" w:type="dxa"/>
+            <w:tcMar>
+              <w:left w:w="105" w:type="dxa"/>
+              <w:right w:w="105" w:type="dxa"/>
+            </w:tcMar>
+            <w:vAlign w:val="top"/>
+          </w:tcPr>
+          <w:p>
+            <w:pPr>
+              <w:spacing w:after="200" w:line="276" w:lineRule="auto"/>
+              <w:ind w:left="90" w:right="0"/>
+              <w:rPr>
+                <w:rFonts w:ascii="Calibri" w:hAnsi="Calibri" w:eastAsia="Calibri" w:cs="Calibri"/>
+                <w:b w:val="0"/>
+                <w:bCs w:val="0"/>
+                <w:i w:val="0"/>
+                <w:iCs w:val="0"/>
+                <w:color w:val="24292E"/>
+                <w:sz w:val="24"/>
+                <w:szCs w:val="24"/>
+              </w:rPr>
+            </w:pPr>
+            <w:r>
+              <w:rPr>
+                <w:rFonts w:ascii="Calibri" w:hAnsi="Calibri" w:eastAsia="Calibri" w:cs="Calibri"/>
+                <w:b w:val="1"/>
+                <w:bCs w:val="1"/>
+                <w:i w:val="0"/>
+                <w:iCs w:val="0"/>
+                <w:color w:val="24292E"/>
+                <w:sz w:val="24"/>
+                <w:szCs w:val="24"/>
+                <w:lang w:val="fi-FI"/>
+              </w:rPr>
+              <w:t>Method</w:t>
+            </w:r>
+          </w:p>
+        </w:tc>
+        <w:tc>
+          <w:tcPr>
+            <w:tcW w:w="7185" w:type="dxa"/>
+            <w:tcMar>
+              <w:left w:w="105" w:type="dxa"/>
+              <w:right w:w="105" w:type="dxa"/>
+            </w:tcMar>
+            <w:vAlign w:val="top"/>
+          </w:tcPr>
+          <w:p>
+            <w:pPr>
+              <w:spacing w:after="200" w:line="276" w:lineRule="auto"/>
+              <w:ind w:left="90" w:right="0"/>
+              <w:rPr>
+                <w:rFonts w:ascii="Calibri" w:hAnsi="Calibri" w:eastAsia="Calibri" w:cs="Calibri"/>
+                <w:b w:val="0"/>
+                <w:bCs w:val="0"/>
+                <w:i w:val="0"/>
+                <w:iCs w:val="0"/>
+                <w:color w:val="24292E"/>
+                <w:sz w:val="21"/>
+                <w:szCs w:val="21"/>
+              </w:rPr>
+            </w:pPr>
+            <w:r>
+              <w:rPr>
+                <w:rFonts w:ascii="Calibri" w:hAnsi="Calibri" w:eastAsia="Calibri" w:cs="Calibri"/>
+                <w:b w:val="0"/>
+                <w:bCs w:val="0"/>
+                <w:i w:val="0"/>
+                <w:iCs w:val="0"/>
+                <w:color w:val="24292E"/>
+                <w:sz w:val="21"/>
+                <w:szCs w:val="21"/>
+                <w:lang w:val="fi-FI"/>
+              </w:rPr>
+              <w:t>GET</w:t>
+            </w:r>
+          </w:p>
+        </w:tc>
+      </w:tr>
+      <w:tr>
+        <w:trPr>
+          <w:trHeight w:val="300"/>
+        </w:trPr>
+        <w:tc>
+          <w:tcPr>
+            <w:tcW w:w="2415" w:type="dxa"/>
+            <w:tcMar>
+              <w:left w:w="105" w:type="dxa"/>
+              <w:right w:w="105" w:type="dxa"/>
+            </w:tcMar>
+            <w:vAlign w:val="top"/>
+          </w:tcPr>
+          <w:p>
+            <w:pPr>
+              <w:spacing w:line="276" w:lineRule="auto"/>
+              <w:ind w:left="90" w:right="0"/>
+              <w:rPr>
+                <w:rFonts w:ascii="Calibri" w:hAnsi="Calibri" w:eastAsia="Calibri" w:cs="Calibri"/>
+                <w:b w:val="0"/>
+                <w:bCs w:val="0"/>
+                <w:i w:val="0"/>
+                <w:iCs w:val="0"/>
+                <w:color w:val="24292E"/>
+                <w:sz w:val="24"/>
+                <w:szCs w:val="24"/>
+              </w:rPr>
+            </w:pPr>
+            <w:r>
+              <w:rPr>
+                <w:rFonts w:ascii="Calibri" w:hAnsi="Calibri" w:eastAsia="Calibri" w:cs="Calibri"/>
+                <w:b w:val="1"/>
+                <w:bCs w:val="1"/>
+                <w:i w:val="0"/>
+                <w:iCs w:val="0"/>
+                <w:color w:val="24292E"/>
+                <w:sz w:val="24"/>
+                <w:szCs w:val="24"/>
+                <w:lang w:val="fi-FI"/>
+              </w:rPr>
+              <w:t>Headers</w:t>
+            </w:r>
+          </w:p>
+        </w:tc>
+        <w:tc>
+          <w:tcPr>
+            <w:tcW w:w="7185" w:type="dxa"/>
+            <w:tcMar>
+              <w:left w:w="105" w:type="dxa"/>
+              <w:right w:w="105" w:type="dxa"/>
+            </w:tcMar>
+            <w:vAlign w:val="top"/>
+          </w:tcPr>
+          <w:p>
+            <w:pPr>
+              <w:pStyle w:val="Normaali"/>
+              <w:suppressLineNumbers w:val="0"/>
+              <w:bidi w:val="0"/>
+              <w:spacing w:before="0" w:beforeAutospacing="off" w:after="0" w:afterAutospacing="off" w:line="276" w:lineRule="auto"/>
+              <w:ind w:left="90" w:right="0"/>
+              <w:jc w:val="left"/>
+            </w:pPr>
+            <w:r>
+              <w:rPr>
+                <w:rFonts w:ascii="Calibri" w:hAnsi="Calibri" w:eastAsia="Calibri" w:cs="Calibri"/>
+                <w:b w:val="0"/>
+                <w:bCs w:val="0"/>
+                <w:i w:val="0"/>
+                <w:iCs w:val="0"/>
+                <w:color w:val="24292E"/>
+                <w:sz w:val="21"/>
+                <w:szCs w:val="21"/>
+                <w:lang w:val="fi-FI"/>
+              </w:rPr>
+              <w:t>Accept</w:t>
+            </w:r>
+            <w:r>
+              <w:rPr>
+                <w:rFonts w:ascii="Calibri" w:hAnsi="Calibri" w:eastAsia="Calibri" w:cs="Calibri"/>
+                <w:b w:val="0"/>
+                <w:bCs w:val="0"/>
+                <w:i w:val="0"/>
+                <w:iCs w:val="0"/>
+                <w:color w:val="24292E"/>
+                <w:sz w:val="21"/>
+                <w:szCs w:val="21"/>
+                <w:lang w:val="fi-FI"/>
+              </w:rPr>
+              <w:t xml:space="preserve">: </w:t>
+            </w:r>
+            <w:r>
+              <w:rPr>
+                <w:rFonts w:ascii="Calibri" w:hAnsi="Calibri" w:eastAsia="Calibri" w:cs="Calibri"/>
+                <w:b w:val="0"/>
+                <w:bCs w:val="0"/>
+                <w:i w:val="0"/>
+                <w:iCs w:val="0"/>
+                <w:color w:val="24292E"/>
+                <w:sz w:val="21"/>
+                <w:szCs w:val="21"/>
+                <w:lang w:val="fi-FI"/>
+              </w:rPr>
+              <w:t>application</w:t>
+            </w:r>
+            <w:r>
+              <w:rPr>
+                <w:rFonts w:ascii="Calibri" w:hAnsi="Calibri" w:eastAsia="Calibri" w:cs="Calibri"/>
+                <w:b w:val="0"/>
+                <w:bCs w:val="0"/>
+                <w:i w:val="0"/>
+                <w:iCs w:val="0"/>
+                <w:color w:val="24292E"/>
+                <w:sz w:val="21"/>
+                <w:szCs w:val="21"/>
+                <w:lang w:val="fi-FI"/>
+              </w:rPr>
+              <w:t>/json</w:t>
+            </w:r>
+          </w:p>
+        </w:tc>
+      </w:tr>
+      <w:tr>
+        <w:trPr>
+          <w:trHeight w:val="300"/>
+        </w:trPr>
+        <w:tc>
+          <w:tcPr>
+            <w:tcW w:w="2415" w:type="dxa"/>
+            <w:tcMar>
+              <w:left w:w="105" w:type="dxa"/>
+              <w:right w:w="105" w:type="dxa"/>
+            </w:tcMar>
+            <w:vAlign w:val="top"/>
+          </w:tcPr>
+          <w:p>
+            <w:pPr>
+              <w:spacing w:after="200" w:line="276" w:lineRule="auto"/>
+              <w:ind w:left="270" w:right="0" w:hanging="180"/>
+              <w:rPr>
+                <w:rFonts w:ascii="Calibri" w:hAnsi="Calibri" w:eastAsia="Calibri" w:cs="Calibri"/>
+                <w:b w:val="0"/>
+                <w:bCs w:val="0"/>
+                <w:i w:val="0"/>
+                <w:iCs w:val="0"/>
+                <w:color w:val="24292E"/>
+                <w:sz w:val="24"/>
+                <w:szCs w:val="24"/>
+              </w:rPr>
+            </w:pPr>
+            <w:r>
+              <w:rPr>
+                <w:rFonts w:ascii="Calibri" w:hAnsi="Calibri" w:eastAsia="Calibri" w:cs="Calibri"/>
+                <w:b w:val="1"/>
+                <w:bCs w:val="1"/>
+                <w:i w:val="0"/>
+                <w:iCs w:val="0"/>
+                <w:color w:val="24292E"/>
+                <w:sz w:val="24"/>
+                <w:szCs w:val="24"/>
+                <w:lang w:val="fi-FI"/>
+              </w:rPr>
+              <w:t>Path</w:t>
+            </w:r>
+            <w:r>
+              <w:rPr>
+                <w:rFonts w:ascii="Calibri" w:hAnsi="Calibri" w:eastAsia="Calibri" w:cs="Calibri"/>
+                <w:b w:val="1"/>
+                <w:bCs w:val="1"/>
+                <w:i w:val="0"/>
+                <w:iCs w:val="0"/>
+                <w:color w:val="24292E"/>
+                <w:sz w:val="24"/>
+                <w:szCs w:val="24"/>
+                <w:lang w:val="fi-FI"/>
+              </w:rPr>
+              <w:t xml:space="preserve"> </w:t>
+            </w:r>
+            <w:r>
+              <w:rPr>
+                <w:rFonts w:ascii="Calibri" w:hAnsi="Calibri" w:eastAsia="Calibri" w:cs="Calibri"/>
+                <w:b w:val="1"/>
+                <w:bCs w:val="1"/>
+                <w:i w:val="0"/>
+                <w:iCs w:val="0"/>
+                <w:color w:val="24292E"/>
+                <w:sz w:val="24"/>
+                <w:szCs w:val="24"/>
+                <w:lang w:val="fi-FI"/>
+              </w:rPr>
+              <w:t>Params</w:t>
+            </w:r>
+            <w:r>
+              <w:rPr>
+                <w:rFonts w:ascii="Calibri" w:hAnsi="Calibri" w:eastAsia="Calibri" w:cs="Calibri"/>
+                <w:b w:val="1"/>
+                <w:bCs w:val="1"/>
+                <w:i w:val="0"/>
+                <w:iCs w:val="0"/>
+                <w:color w:val="24292E"/>
+                <w:sz w:val="24"/>
+                <w:szCs w:val="24"/>
+                <w:lang w:val="fi-FI"/>
+              </w:rPr>
+              <w:t>:</w:t>
+            </w:r>
+          </w:p>
+          <w:p>
+            <w:pPr>
+              <w:pStyle w:val="Luettelokappale"/>
+              <w:numPr>
+                <w:ilvl w:val="0"/>
+                <w:numId w:val="40"/>
+              </w:numPr>
+              <w:spacing w:after="200" w:line="276" w:lineRule="auto"/>
+              <w:ind w:left="270" w:right="0" w:hanging="180"/>
+              <w:rPr>
+                <w:rFonts w:ascii="Calibri" w:hAnsi="Calibri" w:eastAsia="Calibri" w:cs="Calibri"/>
+                <w:b w:val="0"/>
+                <w:bCs w:val="0"/>
+                <w:i w:val="0"/>
+                <w:iCs w:val="0"/>
+                <w:color w:val="24292E"/>
+                <w:sz w:val="24"/>
+                <w:szCs w:val="24"/>
+              </w:rPr>
+            </w:pPr>
+            <w:r>
+              <w:rPr>
+                <w:rFonts w:ascii="Calibri" w:hAnsi="Calibri" w:eastAsia="Calibri" w:cs="Calibri"/>
+                <w:b w:val="0"/>
+                <w:bCs w:val="0"/>
+                <w:i w:val="0"/>
+                <w:iCs w:val="0"/>
+                <w:color w:val="24292E"/>
+                <w:sz w:val="24"/>
+                <w:szCs w:val="24"/>
+                <w:lang w:val="fi-FI"/>
+              </w:rPr>
+              <w:t>Required</w:t>
+            </w:r>
+          </w:p>
+        </w:tc>
+        <w:tc>
+          <w:tcPr>
+            <w:tcW w:w="7185" w:type="dxa"/>
+            <w:tcMar>
+              <w:left w:w="105" w:type="dxa"/>
+              <w:right w:w="105" w:type="dxa"/>
+            </w:tcMar>
+            <w:vAlign w:val="top"/>
+          </w:tcPr>
+          <w:p>
+            <w:pPr>
+              <w:spacing w:after="200" w:line="276" w:lineRule="auto"/>
+              <w:ind w:left="90" w:right="0"/>
+              <w:rPr>
+                <w:rFonts w:ascii="Calibri" w:hAnsi="Calibri" w:eastAsia="Calibri" w:cs="Calibri"/>
+                <w:b w:val="0"/>
+                <w:bCs w:val="0"/>
+                <w:i w:val="0"/>
+                <w:iCs w:val="0"/>
+                <w:color w:val="24292E"/>
+                <w:sz w:val="21"/>
+                <w:szCs w:val="21"/>
+              </w:rPr>
+            </w:pPr>
+          </w:p>
+          <w:p>
+            <w:pPr>
+              <w:spacing w:after="200" w:line="276" w:lineRule="auto"/>
+              <w:ind w:left="90" w:right="0"/>
+              <w:rPr>
+                <w:rFonts w:ascii="Calibri" w:hAnsi="Calibri" w:eastAsia="Calibri" w:cs="Calibri"/>
+                <w:b w:val="0"/>
+                <w:bCs w:val="0"/>
+                <w:i w:val="0"/>
+                <w:iCs w:val="0"/>
+                <w:sz w:val="21"/>
+                <w:szCs w:val="21"/>
+                <w:lang w:val="fi-FI"/>
+              </w:rPr>
+            </w:pPr>
+            <w:r>
+              <w:rPr>
+                <w:rFonts w:ascii="Calibri" w:hAnsi="Calibri" w:eastAsia="Calibri" w:cs="Calibri"/>
+                <w:b w:val="0"/>
+                <w:bCs w:val="0"/>
+                <w:i w:val="0"/>
+                <w:iCs w:val="0"/>
+                <w:sz w:val="21"/>
+                <w:szCs w:val="21"/>
+                <w:lang w:val="fi-FI"/>
+              </w:rPr>
+              <w:t>language</w:t>
+            </w:r>
+            <w:r>
+              <w:rPr>
+                <w:rFonts w:ascii="Calibri" w:hAnsi="Calibri" w:eastAsia="Calibri" w:cs="Calibri"/>
+                <w:b w:val="0"/>
+                <w:bCs w:val="0"/>
+                <w:i w:val="0"/>
+                <w:iCs w:val="0"/>
+                <w:sz w:val="21"/>
+                <w:szCs w:val="21"/>
+                <w:lang w:val="fi-FI"/>
+              </w:rPr>
+              <w:t>=[</w:t>
+            </w:r>
+            <w:r>
+              <w:rPr>
+                <w:rFonts w:ascii="Calibri" w:hAnsi="Calibri" w:eastAsia="Calibri" w:cs="Calibri"/>
+                <w:b w:val="0"/>
+                <w:bCs w:val="0"/>
+                <w:i w:val="0"/>
+                <w:iCs w:val="0"/>
+                <w:sz w:val="21"/>
+                <w:szCs w:val="21"/>
+                <w:lang w:val="fi-FI"/>
+              </w:rPr>
+              <w:t>string</w:t>
+            </w:r>
+            <w:r>
+              <w:rPr>
+                <w:rFonts w:ascii="Calibri" w:hAnsi="Calibri" w:eastAsia="Calibri" w:cs="Calibri"/>
+                <w:b w:val="0"/>
+                <w:bCs w:val="0"/>
+                <w:i w:val="0"/>
+                <w:iCs w:val="0"/>
+                <w:sz w:val="21"/>
+                <w:szCs w:val="21"/>
+                <w:lang w:val="fi-FI"/>
+              </w:rPr>
+              <w:t>]</w:t>
+            </w:r>
+          </w:p>
+        </w:tc>
+      </w:tr>
+      <w:tr>
+        <w:trPr>
+          <w:trHeight w:val="630"/>
+        </w:trPr>
+        <w:tc>
+          <w:tcPr>
+            <w:tcW w:w="2415" w:type="dxa"/>
+            <w:tcMar>
+              <w:left w:w="105" w:type="dxa"/>
+              <w:right w:w="105" w:type="dxa"/>
+            </w:tcMar>
+            <w:vAlign w:val="top"/>
+          </w:tcPr>
+          <w:p>
+            <w:pPr>
+              <w:pStyle w:val="Luettelokappale"/>
+              <w:numPr>
+                <w:ilvl w:val="0"/>
+                <w:numId w:val="41"/>
+              </w:numPr>
+              <w:ind w:left="270" w:right="0" w:hanging="180"/>
+              <w:rPr>
+                <w:rFonts w:ascii="Calibri" w:hAnsi="Calibri" w:eastAsia="Calibri" w:cs="Calibri"/>
+                <w:b w:val="0"/>
+                <w:bCs w:val="0"/>
+                <w:i w:val="0"/>
+                <w:iCs w:val="0"/>
+                <w:color w:val="24292E"/>
+                <w:sz w:val="24"/>
+                <w:szCs w:val="24"/>
+              </w:rPr>
+            </w:pPr>
+            <w:r>
+              <w:rPr>
+                <w:rFonts w:ascii="Calibri" w:hAnsi="Calibri" w:eastAsia="Calibri" w:cs="Calibri"/>
+                <w:b w:val="0"/>
+                <w:bCs w:val="0"/>
+                <w:i w:val="0"/>
+                <w:iCs w:val="0"/>
+                <w:color w:val="24292E"/>
+                <w:sz w:val="24"/>
+                <w:szCs w:val="24"/>
+                <w:lang w:val="fi-FI"/>
+              </w:rPr>
+              <w:t>Optional</w:t>
+            </w:r>
+          </w:p>
+        </w:tc>
+        <w:tc>
+          <w:tcPr>
+            <w:tcW w:w="7185" w:type="dxa"/>
+            <w:tcMar>
+              <w:left w:w="105" w:type="dxa"/>
+              <w:right w:w="105" w:type="dxa"/>
+            </w:tcMar>
+            <w:vAlign w:val="top"/>
+          </w:tcPr>
+          <w:p>
+            <w:pPr>
+              <w:spacing w:after="200" w:line="276" w:lineRule="auto"/>
+              <w:ind w:left="90" w:right="0"/>
+              <w:rPr>
+                <w:rFonts w:ascii="Calibri" w:hAnsi="Calibri" w:eastAsia="Calibri" w:cs="Calibri"/>
+                <w:b w:val="0"/>
+                <w:bCs w:val="0"/>
+                <w:i w:val="0"/>
+                <w:iCs w:val="0"/>
+                <w:color w:val="24292E"/>
+                <w:sz w:val="21"/>
+                <w:szCs w:val="21"/>
+              </w:rPr>
+            </w:pPr>
+            <w:r>
+              <w:rPr>
+                <w:rFonts w:ascii="Calibri" w:hAnsi="Calibri" w:eastAsia="Calibri" w:cs="Calibri"/>
+                <w:b w:val="0"/>
+                <w:bCs w:val="0"/>
+                <w:i w:val="0"/>
+                <w:iCs w:val="0"/>
+                <w:color w:val="24292E"/>
+                <w:sz w:val="21"/>
+                <w:szCs w:val="21"/>
+                <w:lang w:val="fi-FI"/>
+              </w:rPr>
+              <w:t>None</w:t>
+            </w:r>
+          </w:p>
+        </w:tc>
+      </w:tr>
+      <w:tr>
+        <w:trPr>
+          <w:trHeight w:val="300"/>
+        </w:trPr>
+        <w:tc>
+          <w:tcPr>
+            <w:tcW w:w="2415" w:type="dxa"/>
+            <w:tcMar>
+              <w:left w:w="105" w:type="dxa"/>
+              <w:right w:w="105" w:type="dxa"/>
+            </w:tcMar>
+            <w:vAlign w:val="top"/>
+          </w:tcPr>
+          <w:p>
+            <w:pPr>
+              <w:spacing w:after="200" w:line="276" w:lineRule="auto"/>
+              <w:ind w:left="90" w:right="0"/>
+              <w:rPr>
+                <w:rFonts w:ascii="Calibri" w:hAnsi="Calibri" w:eastAsia="Calibri" w:cs="Calibri"/>
+                <w:b w:val="0"/>
+                <w:bCs w:val="0"/>
+                <w:i w:val="0"/>
+                <w:iCs w:val="0"/>
+                <w:color w:val="24292E"/>
+                <w:sz w:val="24"/>
+                <w:szCs w:val="24"/>
+              </w:rPr>
+            </w:pPr>
+            <w:r>
+              <w:rPr>
+                <w:rFonts w:ascii="Calibri" w:hAnsi="Calibri" w:eastAsia="Calibri" w:cs="Calibri"/>
+                <w:b w:val="1"/>
+                <w:bCs w:val="1"/>
+                <w:i w:val="0"/>
+                <w:iCs w:val="0"/>
+                <w:color w:val="24292E"/>
+                <w:sz w:val="24"/>
+                <w:szCs w:val="24"/>
+                <w:lang w:val="fi-FI"/>
+              </w:rPr>
+              <w:t>Data Params</w:t>
+            </w:r>
+          </w:p>
+        </w:tc>
+        <w:tc>
+          <w:tcPr>
+            <w:tcW w:w="7185" w:type="dxa"/>
+            <w:tcMar>
+              <w:left w:w="105" w:type="dxa"/>
+              <w:right w:w="105" w:type="dxa"/>
+            </w:tcMar>
+            <w:vAlign w:val="top"/>
+          </w:tcPr>
+          <w:p>
+            <w:pPr>
+              <w:ind w:left="90" w:right="0"/>
+              <w:rPr>
+                <w:rFonts w:ascii="Calibri" w:hAnsi="Calibri" w:eastAsia="Calibri" w:cs="Calibri"/>
+                <w:b w:val="0"/>
+                <w:bCs w:val="0"/>
+                <w:i w:val="0"/>
+                <w:iCs w:val="0"/>
+                <w:color w:val="24292E"/>
+                <w:sz w:val="21"/>
+                <w:szCs w:val="21"/>
+              </w:rPr>
+            </w:pPr>
+            <w:r>
+              <w:rPr>
+                <w:rFonts w:ascii="Calibri" w:hAnsi="Calibri" w:eastAsia="Calibri" w:cs="Calibri"/>
+                <w:b w:val="0"/>
+                <w:bCs w:val="0"/>
+                <w:i w:val="0"/>
+                <w:iCs w:val="0"/>
+                <w:color w:val="24292E"/>
+                <w:sz w:val="21"/>
+                <w:szCs w:val="21"/>
+                <w:lang w:val="fi-FI"/>
+              </w:rPr>
+              <w:t>No json body</w:t>
+            </w:r>
+          </w:p>
+        </w:tc>
+      </w:tr>
+      <w:tr>
+        <w:trPr>
+          <w:trHeight w:val="300"/>
+        </w:trPr>
+        <w:tc>
+          <w:tcPr>
+            <w:tcW w:w="2415" w:type="dxa"/>
+            <w:tcMar>
+              <w:left w:w="105" w:type="dxa"/>
+              <w:right w:w="105" w:type="dxa"/>
+            </w:tcMar>
+            <w:vAlign w:val="top"/>
+          </w:tcPr>
+          <w:p>
+            <w:pPr>
+              <w:spacing w:after="200" w:line="276" w:lineRule="auto"/>
+              <w:ind w:left="90" w:right="0"/>
+              <w:rPr>
+                <w:rFonts w:ascii="Calibri" w:hAnsi="Calibri" w:eastAsia="Calibri" w:cs="Calibri"/>
+                <w:b w:val="0"/>
+                <w:bCs w:val="0"/>
+                <w:i w:val="0"/>
+                <w:iCs w:val="0"/>
+                <w:color w:val="24292E"/>
+                <w:sz w:val="24"/>
+                <w:szCs w:val="24"/>
+              </w:rPr>
+            </w:pPr>
+            <w:r>
+              <w:rPr>
+                <w:rFonts w:ascii="Calibri" w:hAnsi="Calibri" w:eastAsia="Calibri" w:cs="Calibri"/>
+                <w:b w:val="1"/>
+                <w:bCs w:val="1"/>
+                <w:i w:val="0"/>
+                <w:iCs w:val="0"/>
+                <w:color w:val="24292E"/>
+                <w:sz w:val="24"/>
+                <w:szCs w:val="24"/>
+                <w:lang w:val="fi-FI"/>
+              </w:rPr>
+              <w:t>Success Response</w:t>
+            </w:r>
+          </w:p>
+          <w:p>
+            <w:pPr>
+              <w:ind w:left="90" w:right="0"/>
+              <w:rPr>
+                <w:rFonts w:ascii="Calibri" w:hAnsi="Calibri" w:eastAsia="Calibri" w:cs="Calibri"/>
+                <w:b w:val="0"/>
+                <w:bCs w:val="0"/>
+                <w:i w:val="0"/>
+                <w:iCs w:val="0"/>
+                <w:color w:val="24292E"/>
+                <w:sz w:val="24"/>
+                <w:szCs w:val="24"/>
+              </w:rPr>
+            </w:pPr>
+          </w:p>
+        </w:tc>
+        <w:tc>
+          <w:tcPr>
+            <w:tcW w:w="7185" w:type="dxa"/>
+            <w:tcMar>
+              <w:left w:w="105" w:type="dxa"/>
+              <w:right w:w="105" w:type="dxa"/>
+            </w:tcMar>
+            <w:vAlign w:val="top"/>
+          </w:tcPr>
+          <w:p>
+            <w:pPr>
+              <w:spacing w:after="0" w:afterAutospacing="off" w:line="276" w:lineRule="auto"/>
+              <w:ind w:left="90" w:right="0"/>
+              <w:rPr>
+                <w:rFonts w:ascii="Calibri" w:hAnsi="Calibri" w:eastAsia="Calibri" w:cs="Calibri"/>
+                <w:sz w:val="20"/>
+                <w:szCs w:val="20"/>
+              </w:rPr>
+            </w:pPr>
+            <w:r>
+              <w:rPr>
+                <w:rFonts w:ascii="Calibri" w:hAnsi="Calibri" w:eastAsia="Calibri" w:cs="Calibri" w:asciiTheme="minorAscii" w:hAnsiTheme="minorAscii" w:eastAsiaTheme="minorEastAsia" w:cstheme="minorBidi"/>
+                <w:color w:val="auto"/>
+                <w:sz w:val="20"/>
+                <w:szCs w:val="20"/>
+                <w:lang w:val="en-US" w:eastAsia="en-US" w:bidi="ar-SA"/>
+              </w:rPr>
+              <w:t>Code:</w:t>
+            </w:r>
+            <w:r>
+              <w:rPr>
+                <w:rFonts w:ascii="Calibri" w:hAnsi="Calibri" w:eastAsia="Calibri" w:cs="Calibri" w:asciiTheme="minorAscii" w:hAnsiTheme="minorAscii" w:eastAsiaTheme="minorEastAsia" w:cstheme="minorBidi"/>
+                <w:color w:val="auto"/>
+                <w:sz w:val="20"/>
+                <w:szCs w:val="20"/>
+                <w:lang w:val="en-US" w:eastAsia="en-US" w:bidi="ar-SA"/>
+              </w:rPr>
+              <w:t xml:space="preserve"> 200</w:t>
+            </w:r>
+            <w:r>
+              <w:br/>
+            </w:r>
+            <w:r>
+              <w:rPr>
+                <w:rFonts w:ascii="Calibri" w:hAnsi="Calibri" w:eastAsia="Calibri" w:cs="Calibri" w:asciiTheme="minorAscii" w:hAnsiTheme="minorAscii" w:eastAsiaTheme="minorEastAsia" w:cstheme="minorBidi"/>
+                <w:color w:val="auto"/>
+                <w:sz w:val="20"/>
+                <w:szCs w:val="20"/>
+                <w:lang w:val="en-US" w:eastAsia="en-US" w:bidi="ar-SA"/>
+              </w:rPr>
+              <w:t>Content:</w:t>
+            </w:r>
+            <w:r>
+              <w:rPr>
+                <w:rFonts w:ascii="Calibri" w:hAnsi="Calibri" w:eastAsia="Calibri" w:cs="Calibri" w:asciiTheme="minorAscii" w:hAnsiTheme="minorAscii" w:eastAsiaTheme="minorEastAsia" w:cstheme="minorBidi"/>
+                <w:color w:val="auto"/>
+                <w:sz w:val="20"/>
+                <w:szCs w:val="20"/>
+                <w:lang w:val="en-US" w:eastAsia="en-US" w:bidi="ar-SA"/>
+              </w:rPr>
+              <w:t xml:space="preserve"> </w:t>
+            </w:r>
+          </w:p>
+          <w:p>
+            <w:pPr>
+              <w:spacing w:after="0" w:afterAutospacing="off" w:line="276" w:lineRule="auto"/>
+              <w:ind w:left="90" w:right="0"/>
+              <w:rPr>
+                <w:rFonts w:ascii="Calibri" w:hAnsi="Calibri" w:eastAsia="Calibri" w:cs="Calibri"/>
+                <w:sz w:val="20"/>
+                <w:szCs w:val="20"/>
+                <w:lang w:val="en-US"/>
+              </w:rPr>
+            </w:pPr>
+            <w:r>
+              <w:rPr>
+                <w:rFonts w:ascii="Calibri" w:hAnsi="Calibri" w:eastAsia="Calibri" w:cs="Calibri" w:asciiTheme="minorAscii" w:hAnsiTheme="minorAscii" w:eastAsiaTheme="minorEastAsia" w:cstheme="minorBidi"/>
+                <w:color w:val="auto"/>
+                <w:sz w:val="20"/>
+                <w:szCs w:val="20"/>
+                <w:lang w:val="en-US" w:eastAsia="en-US" w:bidi="ar-SA"/>
+              </w:rPr>
+              <w:t>[</w:t>
+            </w:r>
+          </w:p>
+          <w:p>
+            <w:pPr>
+              <w:spacing w:after="0" w:afterAutospacing="off" w:line="276" w:lineRule="auto"/>
+              <w:ind w:left="90" w:right="0"/>
+              <w:rPr>
+                <w:rFonts w:ascii="Calibri" w:hAnsi="Calibri" w:eastAsia="Calibri" w:cs="Calibri"/>
+                <w:sz w:val="20"/>
+                <w:szCs w:val="20"/>
+              </w:rPr>
+            </w:pPr>
+            <w:r>
+              <w:rPr>
+                <w:rFonts w:ascii="Calibri" w:hAnsi="Calibri" w:eastAsia="Calibri" w:cs="Calibri" w:asciiTheme="minorAscii" w:hAnsiTheme="minorAscii" w:eastAsiaTheme="minorEastAsia" w:cstheme="minorBidi"/>
+                <w:color w:val="auto"/>
+                <w:sz w:val="20"/>
+                <w:szCs w:val="20"/>
+                <w:lang w:val="en-US" w:eastAsia="en-US" w:bidi="ar-SA"/>
+              </w:rPr>
+              <w:t xml:space="preserve"> </w:t>
+            </w:r>
+            <w:r>
+              <w:rPr>
+                <w:rFonts w:ascii="Calibri" w:hAnsi="Calibri" w:eastAsia="Calibri" w:cs="Calibri" w:asciiTheme="minorAscii" w:hAnsiTheme="minorAscii" w:eastAsiaTheme="minorEastAsia" w:cstheme="minorBidi"/>
+                <w:color w:val="auto"/>
+                <w:sz w:val="20"/>
+                <w:szCs w:val="20"/>
+                <w:lang w:val="en-US" w:eastAsia="en-US" w:bidi="ar-SA"/>
+              </w:rPr>
+              <w:t>{</w:t>
+            </w:r>
+          </w:p>
+          <w:p>
+            <w:pPr>
+              <w:pStyle w:val="Normaali"/>
+              <w:spacing w:after="0" w:afterAutospacing="off" w:line="276" w:lineRule="auto"/>
+              <w:ind w:left="90" w:right="0"/>
+              <w:rPr>
+                <w:rFonts w:ascii="Calibri" w:hAnsi="Calibri" w:eastAsia="Calibri" w:cs="Calibri"/>
+                <w:noProof w:val="0"/>
+                <w:sz w:val="20"/>
+                <w:szCs w:val="20"/>
+                <w:lang w:val="en-US"/>
+              </w:rPr>
+            </w:pPr>
+            <w:r>
+              <w:rPr>
+                <w:rFonts w:ascii="Calibri" w:hAnsi="Calibri" w:eastAsia="Calibri" w:cs="Calibri" w:asciiTheme="minorAscii" w:hAnsiTheme="minorAscii" w:eastAsiaTheme="minorEastAsia" w:cstheme="minorBidi"/>
+                <w:color w:val="auto"/>
+                <w:sz w:val="20"/>
+                <w:szCs w:val="20"/>
+                <w:lang w:val="en-US" w:eastAsia="en-US" w:bidi="ar-SA"/>
+              </w:rPr>
+              <w:t xml:space="preserve">   </w:t>
+            </w:r>
+            <w:r>
+              <w:rPr>
+                <w:rFonts w:ascii="Calibri" w:hAnsi="Calibri" w:eastAsia="Calibri" w:cs="Calibri" w:asciiTheme="minorAscii" w:hAnsiTheme="minorAscii" w:eastAsiaTheme="minorEastAsia" w:cstheme="minorBidi"/>
+                <w:noProof w:val="0"/>
+                <w:color w:val="auto"/>
+                <w:sz w:val="20"/>
+                <w:szCs w:val="20"/>
+                <w:lang w:val="en-US" w:eastAsia="en-US" w:bidi="ar-SA"/>
+              </w:rPr>
+              <w:t>"id"</w:t>
+            </w:r>
+            <w:r>
+              <w:rPr>
+                <w:rFonts w:ascii="Calibri" w:hAnsi="Calibri" w:eastAsia="Calibri" w:cs="Calibri" w:asciiTheme="minorAscii" w:hAnsiTheme="minorAscii" w:eastAsiaTheme="minorEastAsia" w:cstheme="minorBidi"/>
+                <w:noProof w:val="0"/>
+                <w:color w:val="auto"/>
+                <w:sz w:val="20"/>
+                <w:szCs w:val="20"/>
+                <w:lang w:val="en-US" w:eastAsia="en-US" w:bidi="ar-SA"/>
+              </w:rPr>
+              <w:t xml:space="preserve">: </w:t>
+            </w:r>
+            <w:r>
+              <w:rPr>
+                <w:rFonts w:ascii="Calibri" w:hAnsi="Calibri" w:eastAsia="Calibri" w:cs="Calibri" w:asciiTheme="minorAscii" w:hAnsiTheme="minorAscii" w:eastAsiaTheme="minorEastAsia" w:cstheme="minorBidi"/>
+                <w:noProof w:val="0"/>
+                <w:color w:val="auto"/>
+                <w:sz w:val="20"/>
+                <w:szCs w:val="20"/>
+                <w:lang w:val="en-US" w:eastAsia="en-US" w:bidi="ar-SA"/>
+              </w:rPr>
+              <w:t>1</w:t>
+            </w:r>
+            <w:r>
+              <w:rPr>
+                <w:rFonts w:ascii="Calibri" w:hAnsi="Calibri" w:eastAsia="Calibri" w:cs="Calibri" w:asciiTheme="minorAscii" w:hAnsiTheme="minorAscii" w:eastAsiaTheme="minorEastAsia" w:cstheme="minorBidi"/>
+                <w:noProof w:val="0"/>
+                <w:color w:val="auto"/>
+                <w:sz w:val="20"/>
+                <w:szCs w:val="20"/>
+                <w:lang w:val="en-US" w:eastAsia="en-US" w:bidi="ar-SA"/>
+              </w:rPr>
+              <w:t xml:space="preserve">, </w:t>
+            </w:r>
+          </w:p>
+          <w:p>
+            <w:pPr>
+              <w:pStyle w:val="Normaali"/>
+              <w:spacing w:after="0" w:afterAutospacing="off" w:line="276" w:lineRule="auto"/>
+              <w:ind w:left="90" w:right="0"/>
+              <w:rPr>
+                <w:rFonts w:ascii="Calibri" w:hAnsi="Calibri" w:eastAsia="Calibri" w:cs="Calibri"/>
+                <w:noProof w:val="0"/>
+                <w:sz w:val="20"/>
+                <w:szCs w:val="20"/>
+                <w:lang w:val="en-US"/>
+              </w:rPr>
+            </w:pPr>
+            <w:r>
+              <w:rPr>
+                <w:rFonts w:ascii="Calibri" w:hAnsi="Calibri" w:eastAsia="Calibri" w:cs="Calibri" w:asciiTheme="minorAscii" w:hAnsiTheme="minorAscii" w:eastAsiaTheme="minorEastAsia" w:cstheme="minorBidi"/>
+                <w:noProof w:val="0"/>
+                <w:color w:val="auto"/>
+                <w:sz w:val="20"/>
+                <w:szCs w:val="20"/>
+                <w:lang w:val="en-US" w:eastAsia="en-US" w:bidi="ar-SA"/>
+              </w:rPr>
+              <w:t xml:space="preserve">   "word": "</w:t>
+            </w:r>
+            <w:r>
+              <w:rPr>
+                <w:rFonts w:ascii="Calibri" w:hAnsi="Calibri" w:eastAsia="Calibri" w:cs="Calibri" w:asciiTheme="minorAscii" w:hAnsiTheme="minorAscii" w:eastAsiaTheme="minorEastAsia" w:cstheme="minorBidi"/>
+                <w:noProof w:val="0"/>
+                <w:color w:val="auto"/>
+                <w:sz w:val="20"/>
+                <w:szCs w:val="20"/>
+                <w:lang w:val="en-US" w:eastAsia="en-US" w:bidi="ar-SA"/>
+              </w:rPr>
+              <w:t>ruoka</w:t>
+            </w:r>
+            <w:r>
+              <w:rPr>
+                <w:rFonts w:ascii="Calibri" w:hAnsi="Calibri" w:eastAsia="Calibri" w:cs="Calibri" w:asciiTheme="minorAscii" w:hAnsiTheme="minorAscii" w:eastAsiaTheme="minorEastAsia" w:cstheme="minorBidi"/>
+                <w:noProof w:val="0"/>
+                <w:color w:val="auto"/>
+                <w:sz w:val="20"/>
+                <w:szCs w:val="20"/>
+                <w:lang w:val="en-US" w:eastAsia="en-US" w:bidi="ar-SA"/>
+              </w:rPr>
+              <w:t xml:space="preserve">", </w:t>
+            </w:r>
+          </w:p>
+          <w:p>
+            <w:pPr>
+              <w:pStyle w:val="Normaali"/>
+              <w:spacing w:after="0" w:afterAutospacing="off" w:line="276" w:lineRule="auto"/>
+              <w:ind w:left="90" w:right="0"/>
+              <w:rPr>
+                <w:rFonts w:ascii="Calibri" w:hAnsi="Calibri" w:eastAsia="Calibri" w:cs="Calibri"/>
+                <w:noProof w:val="0"/>
+                <w:sz w:val="20"/>
+                <w:szCs w:val="20"/>
+                <w:lang w:val="en-US"/>
+              </w:rPr>
+            </w:pPr>
+            <w:r>
+              <w:rPr>
+                <w:rFonts w:ascii="Calibri" w:hAnsi="Calibri" w:eastAsia="Calibri" w:cs="Calibri" w:asciiTheme="minorAscii" w:hAnsiTheme="minorAscii" w:eastAsiaTheme="minorEastAsia" w:cstheme="minorBidi"/>
+                <w:noProof w:val="0"/>
+                <w:color w:val="auto"/>
+                <w:sz w:val="20"/>
+                <w:szCs w:val="20"/>
+                <w:lang w:val="en-US" w:eastAsia="en-US" w:bidi="ar-SA"/>
+              </w:rPr>
+              <w:t xml:space="preserve">   "audio": "audio/fi/ruoka.mp3", </w:t>
+            </w:r>
+          </w:p>
+          <w:p>
+            <w:pPr>
+              <w:pStyle w:val="Normaali"/>
+              <w:spacing w:after="0" w:afterAutospacing="off" w:line="276" w:lineRule="auto"/>
+              <w:ind w:left="90" w:right="0"/>
+              <w:rPr>
+                <w:rFonts w:ascii="Calibri" w:hAnsi="Calibri" w:eastAsia="Calibri" w:cs="Calibri"/>
+                <w:noProof w:val="0"/>
+                <w:sz w:val="20"/>
+                <w:szCs w:val="20"/>
+                <w:lang w:val="en-US"/>
+              </w:rPr>
+            </w:pPr>
+            <w:r>
+              <w:rPr>
+                <w:rFonts w:ascii="Calibri" w:hAnsi="Calibri" w:eastAsia="Calibri" w:cs="Calibri" w:asciiTheme="minorAscii" w:hAnsiTheme="minorAscii" w:eastAsiaTheme="minorEastAsia" w:cstheme="minorBidi"/>
+                <w:noProof w:val="0"/>
+                <w:color w:val="auto"/>
+                <w:sz w:val="20"/>
+                <w:szCs w:val="20"/>
+                <w:lang w:val="en-US" w:eastAsia="en-US" w:bidi="ar-SA"/>
+              </w:rPr>
+              <w:t xml:space="preserve">   "image": "images/food.jpg" </w:t>
+            </w:r>
+          </w:p>
+          <w:p>
+            <w:pPr>
+              <w:pStyle w:val="Normaali"/>
+              <w:spacing w:after="0" w:afterAutospacing="off" w:line="276" w:lineRule="auto"/>
+              <w:ind w:left="90" w:right="0"/>
+              <w:rPr>
+                <w:rFonts w:ascii="Calibri" w:hAnsi="Calibri" w:eastAsia="Calibri" w:cs="Calibri"/>
+                <w:sz w:val="20"/>
+                <w:szCs w:val="20"/>
+                <w:lang w:val="en-US"/>
+              </w:rPr>
+            </w:pPr>
+            <w:r>
+              <w:rPr>
+                <w:rFonts w:ascii="Calibri" w:hAnsi="Calibri" w:eastAsia="Calibri" w:cs="Calibri" w:asciiTheme="minorAscii" w:hAnsiTheme="minorAscii" w:eastAsiaTheme="minorEastAsia" w:cstheme="minorBidi"/>
+                <w:color w:val="auto"/>
+                <w:sz w:val="20"/>
+                <w:szCs w:val="20"/>
+                <w:lang w:val="en-US" w:eastAsia="en-US" w:bidi="ar-SA"/>
+              </w:rPr>
+              <w:t xml:space="preserve"> </w:t>
+            </w:r>
+            <w:r>
+              <w:rPr>
+                <w:rFonts w:ascii="Calibri" w:hAnsi="Calibri" w:eastAsia="Calibri" w:cs="Calibri" w:asciiTheme="minorAscii" w:hAnsiTheme="minorAscii" w:eastAsiaTheme="minorEastAsia" w:cstheme="minorBidi"/>
+                <w:color w:val="auto"/>
+                <w:sz w:val="20"/>
+                <w:szCs w:val="20"/>
+                <w:lang w:val="en-US" w:eastAsia="en-US" w:bidi="ar-SA"/>
+              </w:rPr>
+              <w:t>}</w:t>
+            </w:r>
+          </w:p>
+          <w:p>
+            <w:pPr>
+              <w:pStyle w:val="Normaali"/>
+              <w:spacing w:after="0" w:afterAutospacing="off" w:line="276" w:lineRule="auto"/>
+              <w:ind w:left="90" w:right="0"/>
+              <w:rPr>
+                <w:rFonts w:ascii="Calibri" w:hAnsi="Calibri" w:eastAsia="Calibri" w:cs="Calibri"/>
+                <w:sz w:val="20"/>
+                <w:szCs w:val="20"/>
+              </w:rPr>
+            </w:pPr>
+            <w:r>
+              <w:rPr>
+                <w:rFonts w:ascii="Calibri" w:hAnsi="Calibri" w:eastAsia="Calibri" w:cs="Calibri" w:asciiTheme="minorAscii" w:hAnsiTheme="minorAscii" w:eastAsiaTheme="minorEastAsia" w:cstheme="minorBidi"/>
+                <w:color w:val="auto"/>
+                <w:sz w:val="20"/>
+                <w:szCs w:val="20"/>
+                <w:lang w:val="en-US" w:eastAsia="en-US" w:bidi="ar-SA"/>
+              </w:rPr>
+              <w:t>]</w:t>
+            </w:r>
+          </w:p>
+        </w:tc>
+      </w:tr>
+      <w:tr>
+        <w:trPr>
+          <w:trHeight w:val="300"/>
+        </w:trPr>
+        <w:tc>
+          <w:tcPr>
+            <w:tcW w:w="2415" w:type="dxa"/>
+            <w:tcMar>
+              <w:left w:w="105" w:type="dxa"/>
+              <w:right w:w="105" w:type="dxa"/>
+            </w:tcMar>
+            <w:vAlign w:val="top"/>
+          </w:tcPr>
+          <w:p>
+            <w:pPr>
+              <w:spacing w:after="200" w:line="276" w:lineRule="auto"/>
+              <w:ind w:left="90" w:right="0"/>
+              <w:rPr>
+                <w:rFonts w:ascii="Calibri" w:hAnsi="Calibri" w:eastAsia="Calibri" w:cs="Calibri"/>
+                <w:b w:val="0"/>
+                <w:bCs w:val="0"/>
+                <w:i w:val="0"/>
+                <w:iCs w:val="0"/>
+                <w:color w:val="24292E"/>
+                <w:sz w:val="24"/>
+                <w:szCs w:val="24"/>
+              </w:rPr>
+            </w:pPr>
+            <w:r>
+              <w:rPr>
+                <w:rFonts w:ascii="Calibri" w:hAnsi="Calibri" w:eastAsia="Calibri" w:cs="Calibri"/>
+                <w:b w:val="1"/>
+                <w:bCs w:val="1"/>
+                <w:i w:val="0"/>
+                <w:iCs w:val="0"/>
+                <w:color w:val="24292E"/>
+                <w:sz w:val="24"/>
+                <w:szCs w:val="24"/>
+                <w:lang w:val="fi-FI"/>
+              </w:rPr>
+              <w:t>Error Response</w:t>
+            </w:r>
+          </w:p>
+          <w:p>
+            <w:pPr>
+              <w:spacing w:after="200" w:line="276" w:lineRule="auto"/>
+              <w:ind w:left="90" w:right="0"/>
+              <w:rPr>
+                <w:rFonts w:ascii="Calibri" w:hAnsi="Calibri" w:eastAsia="Calibri" w:cs="Calibri"/>
+                <w:b w:val="0"/>
+                <w:bCs w:val="0"/>
+                <w:i w:val="0"/>
+                <w:iCs w:val="0"/>
+                <w:color w:val="24292E"/>
+                <w:sz w:val="24"/>
+                <w:szCs w:val="24"/>
+              </w:rPr>
+            </w:pPr>
+          </w:p>
+        </w:tc>
+        <w:tc>
+          <w:tcPr>
+            <w:tcW w:w="7185" w:type="dxa"/>
+            <w:tcMar>
+              <w:left w:w="105" w:type="dxa"/>
+              <w:right w:w="105" w:type="dxa"/>
+            </w:tcMar>
+            <w:vAlign w:val="top"/>
+          </w:tcPr>
+          <w:p>
+            <w:pPr>
+              <w:pStyle w:val="Normaali"/>
+              <w:spacing w:after="200" w:line="276" w:lineRule="auto"/>
+              <w:ind w:left="90" w:right="0"/>
+              <w:rPr>
+                <w:rFonts w:ascii="Calibri" w:hAnsi="Calibri" w:eastAsia="Calibri" w:cs="Calibri"/>
+                <w:b w:val="0"/>
+                <w:bCs w:val="0"/>
+                <w:i w:val="0"/>
+                <w:iCs w:val="0"/>
+                <w:color w:val="24292E"/>
+                <w:sz w:val="21"/>
+                <w:szCs w:val="21"/>
+                <w:lang w:val="fi-FI"/>
+              </w:rPr>
+            </w:pPr>
+            <w:r>
+              <w:rPr>
+                <w:rFonts w:ascii="Calibri" w:hAnsi="Calibri" w:eastAsia="Calibri" w:cs="Calibri"/>
+                <w:b w:val="1"/>
+                <w:bCs w:val="1"/>
+                <w:i w:val="0"/>
+                <w:iCs w:val="0"/>
+                <w:color w:val="24292E"/>
+                <w:sz w:val="21"/>
+                <w:szCs w:val="21"/>
+                <w:lang w:val="en-US"/>
+              </w:rPr>
+              <w:t>Code:</w:t>
+            </w:r>
+            <w:r>
+              <w:rPr>
+                <w:rFonts w:ascii="Calibri" w:hAnsi="Calibri" w:eastAsia="Calibri" w:cs="Calibri"/>
+                <w:b w:val="0"/>
+                <w:bCs w:val="0"/>
+                <w:i w:val="0"/>
+                <w:iCs w:val="0"/>
+                <w:color w:val="24292E"/>
+                <w:sz w:val="21"/>
+                <w:szCs w:val="21"/>
+                <w:lang w:val="en-US"/>
+              </w:rPr>
+              <w:t xml:space="preserve"> 40</w:t>
+            </w:r>
+            <w:r>
+              <w:rPr>
+                <w:rFonts w:ascii="Calibri" w:hAnsi="Calibri" w:eastAsia="Calibri" w:cs="Calibri"/>
+                <w:b w:val="0"/>
+                <w:bCs w:val="0"/>
+                <w:i w:val="0"/>
+                <w:iCs w:val="0"/>
+                <w:color w:val="24292E"/>
+                <w:sz w:val="21"/>
+                <w:szCs w:val="21"/>
+                <w:lang w:val="en-US"/>
+              </w:rPr>
+              <w:t>4</w:t>
+            </w:r>
+            <w:r>
+              <w:rPr>
+                <w:rFonts w:ascii="Calibri" w:hAnsi="Calibri" w:eastAsia="Calibri" w:cs="Calibri"/>
+                <w:b w:val="0"/>
+                <w:bCs w:val="0"/>
+                <w:i w:val="0"/>
+                <w:iCs w:val="0"/>
+                <w:color w:val="24292E"/>
+                <w:sz w:val="21"/>
+                <w:szCs w:val="21"/>
+                <w:lang w:val="en-US"/>
+              </w:rPr>
+              <w:t xml:space="preserve"> </w:t>
+            </w:r>
+            <w:r>
+              <w:rPr>
+                <w:rFonts w:ascii="Calibri" w:hAnsi="Calibri" w:eastAsia="Calibri" w:cs="Calibri"/>
+                <w:b w:val="0"/>
+                <w:bCs w:val="0"/>
+                <w:i w:val="0"/>
+                <w:iCs w:val="0"/>
+                <w:color w:val="24292E"/>
+                <w:sz w:val="21"/>
+                <w:szCs w:val="21"/>
+                <w:lang w:val="en-US"/>
+              </w:rPr>
+              <w:t>Not found</w:t>
+            </w:r>
+            <w:r>
+              <w:br/>
+            </w:r>
+            <w:r>
+              <w:rPr>
+                <w:rFonts w:ascii="Calibri" w:hAnsi="Calibri" w:eastAsia="Calibri" w:cs="Calibri"/>
+                <w:b w:val="0"/>
+                <w:bCs w:val="0"/>
+                <w:i w:val="0"/>
+                <w:iCs w:val="0"/>
+                <w:color w:val="24292E"/>
+                <w:sz w:val="21"/>
+                <w:szCs w:val="21"/>
+                <w:lang w:val="fi-FI"/>
+              </w:rPr>
+              <w:t>{ "</w:t>
+            </w:r>
+            <w:r>
+              <w:rPr>
+                <w:rFonts w:ascii="Calibri" w:hAnsi="Calibri" w:eastAsia="Calibri" w:cs="Calibri"/>
+                <w:b w:val="0"/>
+                <w:bCs w:val="0"/>
+                <w:i w:val="0"/>
+                <w:iCs w:val="0"/>
+                <w:color w:val="24292E"/>
+                <w:sz w:val="21"/>
+                <w:szCs w:val="21"/>
+                <w:lang w:val="fi-FI"/>
+              </w:rPr>
+              <w:t>error</w:t>
+            </w:r>
+            <w:r>
+              <w:rPr>
+                <w:rFonts w:ascii="Calibri" w:hAnsi="Calibri" w:eastAsia="Calibri" w:cs="Calibri"/>
+                <w:b w:val="0"/>
+                <w:bCs w:val="0"/>
+                <w:i w:val="0"/>
+                <w:iCs w:val="0"/>
+                <w:color w:val="24292E"/>
+                <w:sz w:val="21"/>
+                <w:szCs w:val="21"/>
+                <w:lang w:val="fi-FI"/>
+              </w:rPr>
+              <w:t>": "</w:t>
+            </w:r>
+            <w:r>
+              <w:rPr>
+                <w:rFonts w:ascii="Calibri" w:hAnsi="Calibri" w:eastAsia="Calibri" w:cs="Calibri"/>
+                <w:noProof w:val="0"/>
+                <w:sz w:val="21"/>
+                <w:szCs w:val="21"/>
+                <w:lang w:val="fi-FI"/>
+              </w:rPr>
+              <w:t xml:space="preserve"> Language </w:t>
+            </w:r>
+            <w:r>
+              <w:rPr>
+                <w:rFonts w:ascii="Calibri" w:hAnsi="Calibri" w:eastAsia="Calibri" w:cs="Calibri"/>
+                <w:noProof w:val="0"/>
+                <w:sz w:val="21"/>
+                <w:szCs w:val="21"/>
+                <w:lang w:val="fi-FI"/>
+              </w:rPr>
+              <w:t>not</w:t>
+            </w:r>
+            <w:r>
+              <w:rPr>
+                <w:rFonts w:ascii="Calibri" w:hAnsi="Calibri" w:eastAsia="Calibri" w:cs="Calibri"/>
+                <w:noProof w:val="0"/>
+                <w:sz w:val="21"/>
+                <w:szCs w:val="21"/>
+                <w:lang w:val="fi-FI"/>
+              </w:rPr>
+              <w:t xml:space="preserve"> </w:t>
+            </w:r>
+            <w:r>
+              <w:rPr>
+                <w:rFonts w:ascii="Calibri" w:hAnsi="Calibri" w:eastAsia="Calibri" w:cs="Calibri"/>
+                <w:noProof w:val="0"/>
+                <w:sz w:val="21"/>
+                <w:szCs w:val="21"/>
+                <w:lang w:val="fi-FI"/>
+              </w:rPr>
+              <w:t>found</w:t>
+            </w:r>
+            <w:r>
+              <w:rPr>
+                <w:rFonts w:ascii="Calibri" w:hAnsi="Calibri" w:eastAsia="Calibri" w:cs="Calibri"/>
+                <w:b w:val="0"/>
+                <w:bCs w:val="0"/>
+                <w:i w:val="0"/>
+                <w:iCs w:val="0"/>
+                <w:color w:val="24292E"/>
+                <w:sz w:val="21"/>
+                <w:szCs w:val="21"/>
+                <w:lang w:val="fi-FI"/>
+              </w:rPr>
+              <w:t>" }</w:t>
+            </w:r>
+          </w:p>
+          <w:p>
+            <w:pPr>
+              <w:spacing w:after="200" w:line="276" w:lineRule="auto"/>
+              <w:ind w:left="90" w:right="0"/>
+              <w:rPr>
+                <w:rFonts w:ascii="Calibri" w:hAnsi="Calibri" w:eastAsia="Calibri" w:cs="Calibri"/>
+                <w:b w:val="0"/>
+                <w:bCs w:val="0"/>
+                <w:i w:val="0"/>
+                <w:iCs w:val="0"/>
+                <w:color w:val="24292E"/>
+                <w:sz w:val="21"/>
+                <w:szCs w:val="21"/>
+              </w:rPr>
+            </w:pPr>
+            <w:r>
+              <w:rPr>
+                <w:rFonts w:ascii="Calibri" w:hAnsi="Calibri" w:eastAsia="Calibri" w:cs="Calibri"/>
+                <w:b w:val="1"/>
+                <w:bCs w:val="1"/>
+                <w:i w:val="0"/>
+                <w:iCs w:val="0"/>
+                <w:color w:val="24292E"/>
+                <w:sz w:val="21"/>
+                <w:szCs w:val="21"/>
+                <w:lang w:val="en-US"/>
+              </w:rPr>
+              <w:t>Code:</w:t>
+            </w:r>
+            <w:r>
+              <w:rPr>
+                <w:rFonts w:ascii="Calibri" w:hAnsi="Calibri" w:eastAsia="Calibri" w:cs="Calibri"/>
+                <w:b w:val="0"/>
+                <w:bCs w:val="0"/>
+                <w:i w:val="0"/>
+                <w:iCs w:val="0"/>
+                <w:color w:val="24292E"/>
+                <w:sz w:val="21"/>
+                <w:szCs w:val="21"/>
+                <w:lang w:val="en-US"/>
+              </w:rPr>
+              <w:t xml:space="preserve"> 500 Internal server error</w:t>
+            </w:r>
+            <w:r>
+              <w:br/>
+            </w:r>
+            <w:r>
+              <w:rPr>
+                <w:rFonts w:ascii="Calibri" w:hAnsi="Calibri" w:eastAsia="Calibri" w:cs="Calibri"/>
+                <w:b w:val="0"/>
+                <w:bCs w:val="0"/>
+                <w:i w:val="0"/>
+                <w:iCs w:val="0"/>
+                <w:color w:val="24292E"/>
+                <w:sz w:val="21"/>
+                <w:szCs w:val="21"/>
+                <w:lang w:val="fi-FI"/>
+              </w:rPr>
+              <w:t>{ "</w:t>
+            </w:r>
+            <w:r>
+              <w:rPr>
+                <w:rFonts w:ascii="Calibri" w:hAnsi="Calibri" w:eastAsia="Calibri" w:cs="Calibri"/>
+                <w:b w:val="0"/>
+                <w:bCs w:val="0"/>
+                <w:i w:val="0"/>
+                <w:iCs w:val="0"/>
+                <w:color w:val="24292E"/>
+                <w:sz w:val="21"/>
+                <w:szCs w:val="21"/>
+                <w:lang w:val="fi-FI"/>
+              </w:rPr>
+              <w:t>error</w:t>
+            </w:r>
+            <w:r>
+              <w:rPr>
+                <w:rFonts w:ascii="Calibri" w:hAnsi="Calibri" w:eastAsia="Calibri" w:cs="Calibri"/>
+                <w:b w:val="0"/>
+                <w:bCs w:val="0"/>
+                <w:i w:val="0"/>
+                <w:iCs w:val="0"/>
+                <w:color w:val="24292E"/>
+                <w:sz w:val="21"/>
+                <w:szCs w:val="21"/>
+                <w:lang w:val="fi-FI"/>
+              </w:rPr>
+              <w:t>": "</w:t>
+            </w:r>
+            <w:r>
+              <w:rPr>
+                <w:rFonts w:ascii="Calibri" w:hAnsi="Calibri" w:eastAsia="Calibri" w:cs="Calibri"/>
+                <w:b w:val="0"/>
+                <w:bCs w:val="0"/>
+                <w:i w:val="0"/>
+                <w:iCs w:val="0"/>
+                <w:color w:val="24292E"/>
+                <w:sz w:val="21"/>
+                <w:szCs w:val="21"/>
+                <w:lang w:val="fi-FI"/>
+              </w:rPr>
+              <w:t>Internal</w:t>
+            </w:r>
+            <w:r>
+              <w:rPr>
+                <w:rFonts w:ascii="Calibri" w:hAnsi="Calibri" w:eastAsia="Calibri" w:cs="Calibri"/>
+                <w:b w:val="0"/>
+                <w:bCs w:val="0"/>
+                <w:i w:val="0"/>
+                <w:iCs w:val="0"/>
+                <w:color w:val="24292E"/>
+                <w:sz w:val="21"/>
+                <w:szCs w:val="21"/>
+                <w:lang w:val="fi-FI"/>
+              </w:rPr>
+              <w:t xml:space="preserve"> s</w:t>
+            </w:r>
+            <w:r>
+              <w:rPr>
+                <w:rFonts w:ascii="Calibri" w:hAnsi="Calibri" w:eastAsia="Calibri" w:cs="Calibri"/>
+                <w:b w:val="0"/>
+                <w:bCs w:val="0"/>
+                <w:i w:val="0"/>
+                <w:iCs w:val="0"/>
+                <w:color w:val="24292E"/>
+                <w:sz w:val="21"/>
+                <w:szCs w:val="21"/>
+                <w:lang w:val="fi-FI"/>
+              </w:rPr>
+              <w:t>erver</w:t>
+            </w:r>
+            <w:r>
+              <w:rPr>
+                <w:rFonts w:ascii="Calibri" w:hAnsi="Calibri" w:eastAsia="Calibri" w:cs="Calibri"/>
+                <w:b w:val="0"/>
+                <w:bCs w:val="0"/>
+                <w:i w:val="0"/>
+                <w:iCs w:val="0"/>
+                <w:color w:val="24292E"/>
+                <w:sz w:val="21"/>
+                <w:szCs w:val="21"/>
+                <w:lang w:val="fi-FI"/>
+              </w:rPr>
+              <w:t xml:space="preserve"> </w:t>
+            </w:r>
+            <w:r>
+              <w:rPr>
+                <w:rFonts w:ascii="Calibri" w:hAnsi="Calibri" w:eastAsia="Calibri" w:cs="Calibri"/>
+                <w:b w:val="0"/>
+                <w:bCs w:val="0"/>
+                <w:i w:val="0"/>
+                <w:iCs w:val="0"/>
+                <w:color w:val="24292E"/>
+                <w:sz w:val="21"/>
+                <w:szCs w:val="21"/>
+                <w:lang w:val="fi-FI"/>
+              </w:rPr>
+              <w:t>error</w:t>
+            </w:r>
+            <w:r>
+              <w:rPr>
+                <w:rFonts w:ascii="Calibri" w:hAnsi="Calibri" w:eastAsia="Calibri" w:cs="Calibri"/>
+                <w:b w:val="0"/>
+                <w:bCs w:val="0"/>
+                <w:i w:val="0"/>
+                <w:iCs w:val="0"/>
+                <w:color w:val="24292E"/>
+                <w:sz w:val="21"/>
+                <w:szCs w:val="21"/>
+                <w:lang w:val="fi-FI"/>
+              </w:rPr>
+              <w:t>"</w:t>
+            </w:r>
+            <w:r>
+              <w:rPr>
+                <w:rFonts w:ascii="Calibri" w:hAnsi="Calibri" w:eastAsia="Calibri" w:cs="Calibri"/>
+                <w:b w:val="0"/>
+                <w:bCs w:val="0"/>
+                <w:i w:val="0"/>
+                <w:iCs w:val="0"/>
+                <w:color w:val="24292E"/>
+                <w:sz w:val="21"/>
+                <w:szCs w:val="21"/>
+                <w:lang w:val="fi-FI"/>
+              </w:rPr>
+              <w:t xml:space="preserve"> }</w:t>
+            </w:r>
+          </w:p>
+        </w:tc>
+      </w:tr>
+      <w:tr>
+        <w:trPr>
+          <w:trHeight w:val="300"/>
+        </w:trPr>
+        <w:tc>
+          <w:tcPr>
+            <w:tcW w:w="2415" w:type="dxa"/>
+            <w:tcMar>
+              <w:left w:w="105" w:type="dxa"/>
+              <w:right w:w="105" w:type="dxa"/>
+            </w:tcMar>
+            <w:vAlign w:val="top"/>
+          </w:tcPr>
+          <w:p>
+            <w:pPr>
+              <w:spacing w:after="200" w:line="276" w:lineRule="auto"/>
+              <w:ind w:left="90" w:right="0"/>
+              <w:rPr>
+                <w:rFonts w:ascii="Calibri" w:hAnsi="Calibri" w:eastAsia="Calibri" w:cs="Calibri"/>
+                <w:b w:val="0"/>
+                <w:bCs w:val="0"/>
+                <w:i w:val="0"/>
+                <w:iCs w:val="0"/>
+                <w:color w:val="24292E"/>
+                <w:sz w:val="24"/>
+                <w:szCs w:val="24"/>
+              </w:rPr>
+            </w:pPr>
+            <w:r>
+              <w:rPr>
+                <w:rFonts w:ascii="Calibri" w:hAnsi="Calibri" w:eastAsia="Calibri" w:cs="Calibri"/>
+                <w:b w:val="1"/>
+                <w:bCs w:val="1"/>
+                <w:i w:val="0"/>
+                <w:iCs w:val="0"/>
+                <w:color w:val="24292E"/>
+                <w:sz w:val="24"/>
+                <w:szCs w:val="24"/>
+                <w:lang w:val="fi-FI"/>
+              </w:rPr>
+              <w:t>Sample Call</w:t>
+            </w:r>
+          </w:p>
+        </w:tc>
+        <w:tc>
+          <w:tcPr>
+            <w:tcW w:w="7185" w:type="dxa"/>
+            <w:tcMar>
+              <w:left w:w="105" w:type="dxa"/>
+              <w:right w:w="105" w:type="dxa"/>
+            </w:tcMar>
+            <w:vAlign w:val="top"/>
+          </w:tcPr>
+          <w:p>
+            <w:pPr>
+              <w:spacing w:after="0" w:afterAutospacing="off" w:line="285" w:lineRule="exact"/>
+              <w:ind w:left="90" w:right="0"/>
+              <w:rPr>
+                <w:rFonts w:ascii="Calibri" w:hAnsi="Calibri" w:eastAsia="Calibri" w:cs="Calibri"/>
+                <w:b w:val="0"/>
+                <w:bCs w:val="0"/>
+                <w:i w:val="0"/>
+                <w:iCs w:val="0"/>
+                <w:color w:val="000000" w:themeColor="text1" w:themeTint="FF" w:themeShade="FF"/>
+                <w:sz w:val="21"/>
+                <w:szCs w:val="21"/>
+              </w:rPr>
+            </w:pPr>
+            <w:r>
+              <w:rPr>
+                <w:rFonts w:ascii="Calibri" w:hAnsi="Calibri" w:eastAsia="Calibri" w:cs="Calibri"/>
+                <w:b w:val="0"/>
+                <w:bCs w:val="0"/>
+                <w:i w:val="0"/>
+                <w:iCs w:val="0"/>
+                <w:color w:val="000000" w:themeColor="text1" w:themeTint="FF" w:themeShade="FF"/>
+                <w:sz w:val="21"/>
+                <w:szCs w:val="21"/>
+                <w:lang w:val="en-US"/>
+              </w:rPr>
+              <w:t>GET</w:t>
+            </w:r>
+            <w:r>
+              <w:rPr>
+                <w:rFonts w:ascii="Calibri" w:hAnsi="Calibri" w:eastAsia="Calibri" w:cs="Calibri" w:asciiTheme="minorAscii" w:hAnsiTheme="minorAscii" w:eastAsiaTheme="minorEastAsia" w:cstheme="minorBidi"/>
+                <w:b w:val="0"/>
+                <w:bCs w:val="0"/>
+                <w:i w:val="0"/>
+                <w:iCs w:val="0"/>
+                <w:color w:val="auto"/>
+                <w:sz w:val="21"/>
+                <w:szCs w:val="21"/>
+                <w:lang w:val="en-US" w:eastAsia="en-US" w:bidi="ar-SA"/>
+              </w:rPr>
+              <w:t xml:space="preserve"> </w:t>
+            </w:r>
+            <w:hyperlink r:id="R20a965a9876546f1">
+              <w:r>
+                <w:rPr>
+                  <w:rFonts w:ascii="Calibri" w:hAnsi="Calibri" w:eastAsia="Calibri" w:cs="Calibri" w:asciiTheme="minorAscii" w:hAnsiTheme="minorAscii" w:eastAsiaTheme="minorEastAsia" w:cstheme="minorBidi"/>
+                  <w:b w:val="0"/>
+                  <w:bCs w:val="0"/>
+                  <w:i w:val="0"/>
+                  <w:iCs w:val="0"/>
+                  <w:color w:val="auto"/>
+                  <w:sz w:val="21"/>
+                  <w:szCs w:val="21"/>
+                  <w:lang w:val="en-US" w:eastAsia="en-US" w:bidi="ar-SA"/>
+                </w:rPr>
+                <w:t>http://localhost:3001/</w:t>
+              </w:r>
+              <w:r>
+                <w:rPr>
+                  <w:rFonts w:ascii="Calibri" w:hAnsi="Calibri" w:eastAsia="Calibri" w:cs="Calibri" w:asciiTheme="minorAscii" w:hAnsiTheme="minorAscii" w:eastAsiaTheme="minorEastAsia" w:cstheme="minorBidi"/>
+                  <w:b w:val="0"/>
+                  <w:bCs w:val="0"/>
+                  <w:i w:val="0"/>
+                  <w:iCs w:val="0"/>
+                  <w:color w:val="auto"/>
+                  <w:sz w:val="21"/>
+                  <w:szCs w:val="21"/>
+                  <w:lang w:val="en-US" w:eastAsia="en-US" w:bidi="ar-SA"/>
+                </w:rPr>
+                <w:t>match-game</w:t>
+              </w:r>
+              <w:r>
+                <w:rPr>
+                  <w:rFonts w:ascii="Calibri" w:hAnsi="Calibri" w:eastAsia="Calibri" w:cs="Calibri" w:asciiTheme="minorAscii" w:hAnsiTheme="minorAscii" w:eastAsiaTheme="minorEastAsia" w:cstheme="minorBidi"/>
+                  <w:b w:val="0"/>
+                  <w:bCs w:val="0"/>
+                  <w:i w:val="0"/>
+                  <w:iCs w:val="0"/>
+                  <w:color w:val="auto"/>
+                  <w:sz w:val="21"/>
+                  <w:szCs w:val="21"/>
+                  <w:lang w:val="en-US" w:eastAsia="en-US" w:bidi="ar-SA"/>
+                </w:rPr>
+                <w:t>/</w:t>
+              </w:r>
+              <w:r>
+                <w:rPr>
+                  <w:rFonts w:ascii="Calibri" w:hAnsi="Calibri" w:eastAsia="Calibri" w:cs="Calibri" w:asciiTheme="minorAscii" w:hAnsiTheme="minorAscii" w:eastAsiaTheme="minorEastAsia" w:cstheme="minorBidi"/>
+                  <w:b w:val="0"/>
+                  <w:bCs w:val="0"/>
+                  <w:i w:val="0"/>
+                  <w:iCs w:val="0"/>
+                  <w:color w:val="auto"/>
+                  <w:sz w:val="21"/>
+                  <w:szCs w:val="21"/>
+                  <w:lang w:val="en-US" w:eastAsia="en-US" w:bidi="ar-SA"/>
+                </w:rPr>
+                <w:t>lang</w:t>
+              </w:r>
+              <w:r>
+                <w:rPr>
+                  <w:rFonts w:ascii="Calibri" w:hAnsi="Calibri" w:eastAsia="Calibri" w:cs="Calibri" w:asciiTheme="minorAscii" w:hAnsiTheme="minorAscii" w:eastAsiaTheme="minorEastAsia" w:cstheme="minorBidi"/>
+                  <w:b w:val="0"/>
+                  <w:bCs w:val="0"/>
+                  <w:i w:val="0"/>
+                  <w:iCs w:val="0"/>
+                  <w:color w:val="auto"/>
+                  <w:sz w:val="21"/>
+                  <w:szCs w:val="21"/>
+                  <w:lang w:val="en-US" w:eastAsia="en-US" w:bidi="ar-SA"/>
+                </w:rPr>
+                <w:t>/</w:t>
+              </w:r>
+            </w:hyperlink>
+            <w:r>
+              <w:rPr>
+                <w:rFonts w:ascii="Calibri" w:hAnsi="Calibri" w:eastAsia="Calibri" w:cs="Calibri" w:asciiTheme="minorAscii" w:hAnsiTheme="minorAscii" w:eastAsiaTheme="minorEastAsia" w:cstheme="minorBidi"/>
+                <w:b w:val="0"/>
+                <w:bCs w:val="0"/>
+                <w:i w:val="0"/>
+                <w:iCs w:val="0"/>
+                <w:color w:val="auto"/>
+                <w:sz w:val="21"/>
+                <w:szCs w:val="21"/>
+                <w:lang w:val="en-US" w:eastAsia="en-US" w:bidi="ar-SA"/>
+              </w:rPr>
+              <w:t xml:space="preserve">fi </w:t>
+            </w:r>
+            <w:r>
+              <w:rPr>
+                <w:rFonts w:ascii="Calibri" w:hAnsi="Calibri" w:eastAsia="Calibri" w:cs="Calibri"/>
+                <w:b w:val="0"/>
+                <w:bCs w:val="0"/>
+                <w:i w:val="0"/>
+                <w:iCs w:val="0"/>
+                <w:color w:val="000000" w:themeColor="text1" w:themeTint="FF" w:themeShade="FF"/>
+                <w:sz w:val="21"/>
+                <w:szCs w:val="21"/>
+                <w:lang w:val="en-US"/>
+              </w:rPr>
+              <w:t xml:space="preserve"> </w:t>
+            </w:r>
+            <w:r>
+              <w:rPr>
+                <w:rFonts w:ascii="Calibri" w:hAnsi="Calibri" w:eastAsia="Calibri" w:cs="Calibri"/>
+                <w:b w:val="0"/>
+                <w:bCs w:val="0"/>
+                <w:i w:val="0"/>
+                <w:iCs w:val="0"/>
+                <w:color w:val="000000" w:themeColor="text1" w:themeTint="FF" w:themeShade="FF"/>
+                <w:sz w:val="21"/>
+                <w:szCs w:val="21"/>
+                <w:lang w:val="en-US"/>
+              </w:rPr>
+              <w:t>HTTP/1.1</w:t>
+            </w:r>
+          </w:p>
+          <w:p>
+            <w:pPr>
+              <w:pStyle w:val="Normaali"/>
+              <w:suppressLineNumbers w:val="0"/>
+              <w:bidi w:val="0"/>
+              <w:spacing w:before="0" w:beforeAutospacing="off" w:after="0" w:afterAutospacing="off" w:line="276" w:lineRule="auto"/>
+              <w:ind w:left="90" w:right="0"/>
+              <w:jc w:val="left"/>
+              <w:rPr>
+                <w:rFonts w:ascii="Calibri" w:hAnsi="Calibri" w:eastAsia="Calibri" w:cs="Calibri"/>
+                <w:b w:val="0"/>
+                <w:bCs w:val="0"/>
+                <w:i w:val="0"/>
+                <w:iCs w:val="0"/>
+                <w:color w:val="24292E"/>
+                <w:sz w:val="21"/>
+                <w:szCs w:val="21"/>
+                <w:lang w:val="fi-FI"/>
+              </w:rPr>
+            </w:pPr>
+            <w:r>
+              <w:rPr>
+                <w:rFonts w:ascii="Calibri" w:hAnsi="Calibri" w:eastAsia="Calibri" w:cs="Calibri"/>
+                <w:b w:val="0"/>
+                <w:bCs w:val="0"/>
+                <w:i w:val="0"/>
+                <w:iCs w:val="0"/>
+                <w:color w:val="24292E"/>
+                <w:sz w:val="21"/>
+                <w:szCs w:val="21"/>
+                <w:lang w:val="fi-FI"/>
+              </w:rPr>
+              <w:t>Accept</w:t>
+            </w:r>
+            <w:r>
+              <w:rPr>
+                <w:rFonts w:ascii="Calibri" w:hAnsi="Calibri" w:eastAsia="Calibri" w:cs="Calibri"/>
+                <w:b w:val="0"/>
+                <w:bCs w:val="0"/>
+                <w:i w:val="0"/>
+                <w:iCs w:val="0"/>
+                <w:color w:val="24292E"/>
+                <w:sz w:val="21"/>
+                <w:szCs w:val="21"/>
+                <w:lang w:val="fi-FI"/>
+              </w:rPr>
+              <w:t xml:space="preserve">: </w:t>
+            </w:r>
+            <w:r>
+              <w:rPr>
+                <w:rFonts w:ascii="Calibri" w:hAnsi="Calibri" w:eastAsia="Calibri" w:cs="Calibri"/>
+                <w:b w:val="0"/>
+                <w:bCs w:val="0"/>
+                <w:i w:val="0"/>
+                <w:iCs w:val="0"/>
+                <w:color w:val="24292E"/>
+                <w:sz w:val="21"/>
+                <w:szCs w:val="21"/>
+                <w:lang w:val="fi-FI"/>
+              </w:rPr>
+              <w:t>application</w:t>
+            </w:r>
+            <w:r>
+              <w:rPr>
+                <w:rFonts w:ascii="Calibri" w:hAnsi="Calibri" w:eastAsia="Calibri" w:cs="Calibri"/>
+                <w:b w:val="0"/>
+                <w:bCs w:val="0"/>
+                <w:i w:val="0"/>
+                <w:iCs w:val="0"/>
+                <w:color w:val="24292E"/>
+                <w:sz w:val="21"/>
+                <w:szCs w:val="21"/>
+                <w:lang w:val="fi-FI"/>
+              </w:rPr>
+              <w:t>/</w:t>
+            </w:r>
+            <w:r>
+              <w:rPr>
+                <w:rFonts w:ascii="Calibri" w:hAnsi="Calibri" w:eastAsia="Calibri" w:cs="Calibri"/>
+                <w:b w:val="0"/>
+                <w:bCs w:val="0"/>
+                <w:i w:val="0"/>
+                <w:iCs w:val="0"/>
+                <w:color w:val="24292E"/>
+                <w:sz w:val="21"/>
+                <w:szCs w:val="21"/>
+                <w:lang w:val="fi-FI"/>
+              </w:rPr>
+              <w:t>json</w:t>
+            </w:r>
+          </w:p>
+        </w:tc>
+      </w:tr>
+      <w:tr>
+        <w:trPr>
+          <w:trHeight w:val="300"/>
+        </w:trPr>
+        <w:tc>
+          <w:tcPr>
+            <w:tcW w:w="2415" w:type="dxa"/>
+            <w:tcMar>
+              <w:left w:w="105" w:type="dxa"/>
+              <w:right w:w="105" w:type="dxa"/>
+            </w:tcMar>
+            <w:vAlign w:val="top"/>
+          </w:tcPr>
+          <w:p>
+            <w:pPr>
+              <w:spacing w:after="200" w:line="276" w:lineRule="auto"/>
+              <w:ind w:left="90" w:right="0"/>
+              <w:rPr>
+                <w:rFonts w:ascii="Calibri" w:hAnsi="Calibri" w:eastAsia="Calibri" w:cs="Calibri"/>
+                <w:b w:val="0"/>
+                <w:bCs w:val="0"/>
+                <w:i w:val="0"/>
+                <w:iCs w:val="0"/>
+                <w:color w:val="24292E"/>
+                <w:sz w:val="24"/>
+                <w:szCs w:val="24"/>
+              </w:rPr>
+            </w:pPr>
+            <w:r>
+              <w:rPr>
+                <w:rFonts w:ascii="Calibri" w:hAnsi="Calibri" w:eastAsia="Calibri" w:cs="Calibri"/>
+                <w:b w:val="1"/>
+                <w:bCs w:val="1"/>
+                <w:i w:val="0"/>
+                <w:iCs w:val="0"/>
+                <w:color w:val="24292E"/>
+                <w:sz w:val="24"/>
+                <w:szCs w:val="24"/>
+                <w:lang w:val="fi-FI"/>
+              </w:rPr>
+              <w:t>Notes</w:t>
+            </w:r>
+          </w:p>
+          <w:p>
+            <w:pPr>
+              <w:spacing w:line="276" w:lineRule="auto"/>
+              <w:ind w:left="90" w:right="0"/>
+              <w:rPr>
+                <w:rFonts w:ascii="Calibri" w:hAnsi="Calibri" w:eastAsia="Calibri" w:cs="Calibri"/>
+                <w:b w:val="0"/>
+                <w:bCs w:val="0"/>
+                <w:i w:val="0"/>
+                <w:iCs w:val="0"/>
+                <w:color w:val="24292E"/>
+                <w:sz w:val="24"/>
+                <w:szCs w:val="24"/>
+              </w:rPr>
+            </w:pPr>
+          </w:p>
+        </w:tc>
+        <w:tc>
+          <w:tcPr>
+            <w:tcW w:w="7185" w:type="dxa"/>
+            <w:tcMar>
+              <w:left w:w="105" w:type="dxa"/>
+              <w:right w:w="105" w:type="dxa"/>
+            </w:tcMar>
+            <w:vAlign w:val="top"/>
+          </w:tcPr>
+          <w:p>
+            <w:pPr>
+              <w:pStyle w:val="Luettelokappale"/>
+              <w:numPr>
+                <w:ilvl w:val="0"/>
+                <w:numId w:val="40"/>
+              </w:numPr>
+              <w:suppressLineNumbers w:val="0"/>
+              <w:bidi w:val="0"/>
+              <w:spacing w:before="240" w:beforeAutospacing="off" w:after="240" w:afterAutospacing="off" w:line="240" w:lineRule="auto"/>
+              <w:ind w:left="180" w:right="0" w:hanging="180"/>
+              <w:jc w:val="left"/>
+              <w:rPr>
+                <w:rFonts w:ascii="Calibri" w:hAnsi="Calibri" w:eastAsia="Calibri" w:cs="Calibri"/>
+                <w:b w:val="0"/>
+                <w:bCs w:val="0"/>
+                <w:i w:val="0"/>
+                <w:iCs w:val="0"/>
+                <w:sz w:val="21"/>
+                <w:szCs w:val="21"/>
+                <w:lang w:val="en-US"/>
+              </w:rPr>
+            </w:pPr>
+            <w:r>
+              <w:rPr>
+                <w:rFonts w:ascii="Calibri" w:hAnsi="Calibri" w:eastAsia="Calibri" w:cs="Calibri"/>
+                <w:b w:val="0"/>
+                <w:bCs w:val="0"/>
+                <w:i w:val="0"/>
+                <w:iCs w:val="0"/>
+                <w:sz w:val="21"/>
+                <w:szCs w:val="21"/>
+                <w:lang w:val="en-US"/>
+              </w:rPr>
+              <w:t xml:space="preserve">Returns list of words from database tables “words” and “word_translations” </w:t>
+            </w:r>
+          </w:p>
+        </w:tc>
+      </w:tr>
+    </w:tbl>
     <w:p>
       <w:pPr>
         <w:pStyle w:val="Normaali"/>
@@ -3320,6 +5979,25 @@
         <w:pStyle w:val="Normaali"/>
         <w:bidi w:val="0"/>
         <w:spacing w:before="240" w:beforeAutospacing="off" w:after="240" w:afterAutospacing="off"/>
+        <w:ind w:left="0"/>
+        <w:jc w:val="left"/>
+      </w:pPr>
+      <w:r>
+        <w:rPr>
+          <w:rFonts w:ascii="Calibri" w:hAnsi="Calibri" w:eastAsia="Calibri" w:cs="Calibri"/>
+          <w:noProof w:val="0"/>
+          <w:sz w:val="20"/>
+          <w:szCs w:val="20"/>
+          <w:lang w:val="en-US"/>
+        </w:rPr>
+        <w:t>Each Match Game includes a feedback system: after each match, the user receives visual feedback indicating whether the answer is correct or incorrect. After all pairs have been successfully matched, a win panel is displayed.</w:t>
+      </w:r>
+    </w:p>
+    <w:p>
+      <w:pPr>
+        <w:pStyle w:val="Normaali"/>
+        <w:bidi w:val="0"/>
+        <w:spacing w:before="240" w:beforeAutospacing="off" w:after="240" w:afterAutospacing="off"/>
         <w:jc w:val="left"/>
         <w:rPr>
           <w:rFonts w:ascii="Calibri" w:hAnsi="Calibri" w:eastAsia="Calibri" w:cs="Calibri"/>
@@ -3422,6 +6100,19 @@
         </w:rPr>
         <w:t>The game also implements a color theme system, allowing the user to switch between light and dark modes. This feature changes the background and text colors to improve usability and user experience.</w:t>
       </w:r>
+    </w:p>
+    <w:p>
+      <w:pPr>
+        <w:spacing w:before="240" w:beforeAutospacing="off" w:after="240" w:afterAutospacing="off"/>
+        <w:jc w:val="left"/>
+        <w:rPr>
+          <w:rFonts w:ascii="Calibri" w:hAnsi="Calibri" w:eastAsia="Calibri" w:cs="Calibri"/>
+          <w:noProof w:val="0"/>
+          <w:sz w:val="20"/>
+          <w:szCs w:val="20"/>
+          <w:lang w:val="en-US"/>
+        </w:rPr>
+      </w:pPr>
     </w:p>
     <w:p>
       <w:r>
@@ -3440,6 +6131,342 @@
 
 <file path=word/numbering.xml><?xml version="1.0" encoding="utf-8"?>
 <w:numbering xmlns:wpc="http://schemas.microsoft.com/office/word/2010/wordprocessingCanvas" xmlns:cx="http://schemas.microsoft.com/office/drawing/2014/chartex" xmlns:cx1="http://schemas.microsoft.com/office/drawing/2015/9/8/chartex" xmlns:cx2="http://schemas.microsoft.com/office/drawing/2015/10/21/chartex" xmlns:cx3="http://schemas.microsoft.com/office/drawing/2016/5/9/chartex" xmlns:cx4="http://schemas.microsoft.com/office/drawing/2016/5/10/chartex" xmlns:cx5="http://schemas.microsoft.com/office/drawing/2016/5/11/chartex" xmlns:cx6="http://schemas.microsoft.com/office/drawing/2016/5/12/chartex" xmlns:cx7="http://schemas.microsoft.com/office/drawing/2016/5/13/chartex" xmlns:cx8="http://schemas.microsoft.com/office/drawing/2016/5/14/chartex" xmlns:mc="http://schemas.openxmlformats.org/markup-compatibility/2006" xmlns:aink="http://schemas.microsoft.com/office/drawing/2016/ink" xmlns:am3d="http://schemas.microsoft.com/office/drawing/2017/model3d" xmlns:o="urn:schemas-microsoft-com:office:office" xmlns:r="http://schemas.openxmlformats.org/officeDocument/2006/relationships" xmlns:m="http://schemas.openxmlformats.org/officeDocument/2006/math" xmlns:v="urn:schemas-microsoft-com:vml" xmlns:wp14="http://schemas.microsoft.com/office/word/2010/wordprocessingDrawing" xmlns:wp="http://schemas.openxmlformats.org/drawingml/2006/wordprocessingDrawing" xmlns:w10="urn:schemas-microsoft-com:office:word" xmlns:w="http://schemas.openxmlformats.org/wordprocessingml/2006/main" xmlns:w14="http://schemas.microsoft.com/office/word/2010/wordml" xmlns:w15="http://schemas.microsoft.com/office/word/2012/wordml" xmlns:w16cex="http://schemas.microsoft.com/office/word/2018/wordml/cex" xmlns:w16cid="http://schemas.microsoft.com/office/word/2016/wordml/cid" xmlns:w16="http://schemas.microsoft.com/office/word/2018/wordml" xmlns:w16sdtdh="http://schemas.microsoft.com/office/word/2020/wordml/sdtdatahash" xmlns:w16se="http://schemas.microsoft.com/office/word/2015/wordml/symex" xmlns:wpg="http://schemas.microsoft.com/office/word/2010/wordprocessingGroup" xmlns:wpi="http://schemas.microsoft.com/office/word/2010/wordprocessingInk" xmlns:wne="http://schemas.microsoft.com/office/word/2006/wordml" xmlns:wps="http://schemas.microsoft.com/office/word/2010/wordprocessingShape" mc:Ignorable="w14 w15 w16se w16cid w16 w16cex w16sdtdh wp14">
+  <w:abstractNum xmlns:w="http://schemas.openxmlformats.org/wordprocessingml/2006/main" w:abstractNumId="41">
+    <w:nsid w:val="4c27c050"/>
+    <w:multiLevelType xmlns:w="http://schemas.openxmlformats.org/wordprocessingml/2006/main" w:val="hybridMultilevel"/>
+    <w:lvl xmlns:w="http://schemas.openxmlformats.org/wordprocessingml/2006/main" w:ilvl="0">
+      <w:start w:val="1"/>
+      <w:numFmt w:val="bullet"/>
+      <w:lvlText w:val=""/>
+      <w:lvlJc w:val="left"/>
+      <w:pPr>
+        <w:ind w:left="720" w:hanging="360"/>
+      </w:pPr>
+      <w:rPr>
+        <w:rFonts w:hint="default" w:ascii="Symbol" w:hAnsi="Symbol"/>
+      </w:rPr>
+    </w:lvl>
+    <w:lvl xmlns:w="http://schemas.openxmlformats.org/wordprocessingml/2006/main" w:ilvl="1">
+      <w:start w:val="1"/>
+      <w:numFmt w:val="bullet"/>
+      <w:lvlText w:val="o"/>
+      <w:lvlJc w:val="left"/>
+      <w:pPr>
+        <w:ind w:left="1440" w:hanging="360"/>
+      </w:pPr>
+      <w:rPr>
+        <w:rFonts w:hint="default" w:ascii="Courier New" w:hAnsi="Courier New"/>
+      </w:rPr>
+    </w:lvl>
+    <w:lvl xmlns:w="http://schemas.openxmlformats.org/wordprocessingml/2006/main" w:ilvl="2">
+      <w:start w:val="1"/>
+      <w:numFmt w:val="bullet"/>
+      <w:lvlText w:val=""/>
+      <w:lvlJc w:val="left"/>
+      <w:pPr>
+        <w:ind w:left="2160" w:hanging="360"/>
+      </w:pPr>
+      <w:rPr>
+        <w:rFonts w:hint="default" w:ascii="Wingdings" w:hAnsi="Wingdings"/>
+      </w:rPr>
+    </w:lvl>
+    <w:lvl xmlns:w="http://schemas.openxmlformats.org/wordprocessingml/2006/main" w:ilvl="3">
+      <w:start w:val="1"/>
+      <w:numFmt w:val="bullet"/>
+      <w:lvlText w:val=""/>
+      <w:lvlJc w:val="left"/>
+      <w:pPr>
+        <w:ind w:left="2880" w:hanging="360"/>
+      </w:pPr>
+      <w:rPr>
+        <w:rFonts w:hint="default" w:ascii="Symbol" w:hAnsi="Symbol"/>
+      </w:rPr>
+    </w:lvl>
+    <w:lvl xmlns:w="http://schemas.openxmlformats.org/wordprocessingml/2006/main" w:ilvl="4">
+      <w:start w:val="1"/>
+      <w:numFmt w:val="bullet"/>
+      <w:lvlText w:val="o"/>
+      <w:lvlJc w:val="left"/>
+      <w:pPr>
+        <w:ind w:left="3600" w:hanging="360"/>
+      </w:pPr>
+      <w:rPr>
+        <w:rFonts w:hint="default" w:ascii="Courier New" w:hAnsi="Courier New"/>
+      </w:rPr>
+    </w:lvl>
+    <w:lvl xmlns:w="http://schemas.openxmlformats.org/wordprocessingml/2006/main" w:ilvl="5">
+      <w:start w:val="1"/>
+      <w:numFmt w:val="bullet"/>
+      <w:lvlText w:val=""/>
+      <w:lvlJc w:val="left"/>
+      <w:pPr>
+        <w:ind w:left="4320" w:hanging="360"/>
+      </w:pPr>
+      <w:rPr>
+        <w:rFonts w:hint="default" w:ascii="Wingdings" w:hAnsi="Wingdings"/>
+      </w:rPr>
+    </w:lvl>
+    <w:lvl xmlns:w="http://schemas.openxmlformats.org/wordprocessingml/2006/main" w:ilvl="6">
+      <w:start w:val="1"/>
+      <w:numFmt w:val="bullet"/>
+      <w:lvlText w:val=""/>
+      <w:lvlJc w:val="left"/>
+      <w:pPr>
+        <w:ind w:left="5040" w:hanging="360"/>
+      </w:pPr>
+      <w:rPr>
+        <w:rFonts w:hint="default" w:ascii="Symbol" w:hAnsi="Symbol"/>
+      </w:rPr>
+    </w:lvl>
+    <w:lvl xmlns:w="http://schemas.openxmlformats.org/wordprocessingml/2006/main" w:ilvl="7">
+      <w:start w:val="1"/>
+      <w:numFmt w:val="bullet"/>
+      <w:lvlText w:val="o"/>
+      <w:lvlJc w:val="left"/>
+      <w:pPr>
+        <w:ind w:left="5760" w:hanging="360"/>
+      </w:pPr>
+      <w:rPr>
+        <w:rFonts w:hint="default" w:ascii="Courier New" w:hAnsi="Courier New"/>
+      </w:rPr>
+    </w:lvl>
+    <w:lvl xmlns:w="http://schemas.openxmlformats.org/wordprocessingml/2006/main" w:ilvl="8">
+      <w:start w:val="1"/>
+      <w:numFmt w:val="bullet"/>
+      <w:lvlText w:val=""/>
+      <w:lvlJc w:val="left"/>
+      <w:pPr>
+        <w:ind w:left="6480" w:hanging="360"/>
+      </w:pPr>
+      <w:rPr>
+        <w:rFonts w:hint="default" w:ascii="Wingdings" w:hAnsi="Wingdings"/>
+      </w:rPr>
+    </w:lvl>
+  </w:abstractNum>
+  <w:abstractNum xmlns:w="http://schemas.openxmlformats.org/wordprocessingml/2006/main" w:abstractNumId="40">
+    <w:nsid w:val="33118237"/>
+    <w:multiLevelType xmlns:w="http://schemas.openxmlformats.org/wordprocessingml/2006/main" w:val="hybridMultilevel"/>
+    <w:lvl xmlns:w="http://schemas.openxmlformats.org/wordprocessingml/2006/main" w:ilvl="0">
+      <w:start w:val="1"/>
+      <w:numFmt w:val="bullet"/>
+      <w:lvlText w:val=""/>
+      <w:lvlJc w:val="left"/>
+      <w:pPr>
+        <w:ind w:left="720" w:hanging="360"/>
+      </w:pPr>
+      <w:rPr>
+        <w:rFonts w:hint="default" w:ascii="Symbol" w:hAnsi="Symbol"/>
+      </w:rPr>
+    </w:lvl>
+    <w:lvl xmlns:w="http://schemas.openxmlformats.org/wordprocessingml/2006/main" w:ilvl="1">
+      <w:start w:val="1"/>
+      <w:numFmt w:val="bullet"/>
+      <w:lvlText w:val="o"/>
+      <w:lvlJc w:val="left"/>
+      <w:pPr>
+        <w:ind w:left="1440" w:hanging="360"/>
+      </w:pPr>
+      <w:rPr>
+        <w:rFonts w:hint="default" w:ascii="Courier New" w:hAnsi="Courier New"/>
+      </w:rPr>
+    </w:lvl>
+    <w:lvl xmlns:w="http://schemas.openxmlformats.org/wordprocessingml/2006/main" w:ilvl="2">
+      <w:start w:val="1"/>
+      <w:numFmt w:val="bullet"/>
+      <w:lvlText w:val=""/>
+      <w:lvlJc w:val="left"/>
+      <w:pPr>
+        <w:ind w:left="2160" w:hanging="360"/>
+      </w:pPr>
+      <w:rPr>
+        <w:rFonts w:hint="default" w:ascii="Wingdings" w:hAnsi="Wingdings"/>
+      </w:rPr>
+    </w:lvl>
+    <w:lvl xmlns:w="http://schemas.openxmlformats.org/wordprocessingml/2006/main" w:ilvl="3">
+      <w:start w:val="1"/>
+      <w:numFmt w:val="bullet"/>
+      <w:lvlText w:val=""/>
+      <w:lvlJc w:val="left"/>
+      <w:pPr>
+        <w:ind w:left="2880" w:hanging="360"/>
+      </w:pPr>
+      <w:rPr>
+        <w:rFonts w:hint="default" w:ascii="Symbol" w:hAnsi="Symbol"/>
+      </w:rPr>
+    </w:lvl>
+    <w:lvl xmlns:w="http://schemas.openxmlformats.org/wordprocessingml/2006/main" w:ilvl="4">
+      <w:start w:val="1"/>
+      <w:numFmt w:val="bullet"/>
+      <w:lvlText w:val="o"/>
+      <w:lvlJc w:val="left"/>
+      <w:pPr>
+        <w:ind w:left="3600" w:hanging="360"/>
+      </w:pPr>
+      <w:rPr>
+        <w:rFonts w:hint="default" w:ascii="Courier New" w:hAnsi="Courier New"/>
+      </w:rPr>
+    </w:lvl>
+    <w:lvl xmlns:w="http://schemas.openxmlformats.org/wordprocessingml/2006/main" w:ilvl="5">
+      <w:start w:val="1"/>
+      <w:numFmt w:val="bullet"/>
+      <w:lvlText w:val=""/>
+      <w:lvlJc w:val="left"/>
+      <w:pPr>
+        <w:ind w:left="4320" w:hanging="360"/>
+      </w:pPr>
+      <w:rPr>
+        <w:rFonts w:hint="default" w:ascii="Wingdings" w:hAnsi="Wingdings"/>
+      </w:rPr>
+    </w:lvl>
+    <w:lvl xmlns:w="http://schemas.openxmlformats.org/wordprocessingml/2006/main" w:ilvl="6">
+      <w:start w:val="1"/>
+      <w:numFmt w:val="bullet"/>
+      <w:lvlText w:val=""/>
+      <w:lvlJc w:val="left"/>
+      <w:pPr>
+        <w:ind w:left="5040" w:hanging="360"/>
+      </w:pPr>
+      <w:rPr>
+        <w:rFonts w:hint="default" w:ascii="Symbol" w:hAnsi="Symbol"/>
+      </w:rPr>
+    </w:lvl>
+    <w:lvl xmlns:w="http://schemas.openxmlformats.org/wordprocessingml/2006/main" w:ilvl="7">
+      <w:start w:val="1"/>
+      <w:numFmt w:val="bullet"/>
+      <w:lvlText w:val="o"/>
+      <w:lvlJc w:val="left"/>
+      <w:pPr>
+        <w:ind w:left="5760" w:hanging="360"/>
+      </w:pPr>
+      <w:rPr>
+        <w:rFonts w:hint="default" w:ascii="Courier New" w:hAnsi="Courier New"/>
+      </w:rPr>
+    </w:lvl>
+    <w:lvl xmlns:w="http://schemas.openxmlformats.org/wordprocessingml/2006/main" w:ilvl="8">
+      <w:start w:val="1"/>
+      <w:numFmt w:val="bullet"/>
+      <w:lvlText w:val=""/>
+      <w:lvlJc w:val="left"/>
+      <w:pPr>
+        <w:ind w:left="6480" w:hanging="360"/>
+      </w:pPr>
+      <w:rPr>
+        <w:rFonts w:hint="default" w:ascii="Wingdings" w:hAnsi="Wingdings"/>
+      </w:rPr>
+    </w:lvl>
+  </w:abstractNum>
+  <w:abstractNum xmlns:w="http://schemas.openxmlformats.org/wordprocessingml/2006/main" w:abstractNumId="39">
+    <w:nsid w:val="1c869337"/>
+    <w:multiLevelType xmlns:w="http://schemas.openxmlformats.org/wordprocessingml/2006/main" w:val="hybridMultilevel"/>
+    <w:lvl xmlns:w="http://schemas.openxmlformats.org/wordprocessingml/2006/main" w:ilvl="0">
+      <w:start w:val="1"/>
+      <w:numFmt w:val="bullet"/>
+      <w:lvlText w:val=""/>
+      <w:lvlJc w:val="left"/>
+      <w:pPr>
+        <w:ind w:left="720" w:hanging="360"/>
+      </w:pPr>
+      <w:rPr>
+        <w:rFonts w:hint="default" w:ascii="Symbol" w:hAnsi="Symbol"/>
+      </w:rPr>
+    </w:lvl>
+    <w:lvl xmlns:w="http://schemas.openxmlformats.org/wordprocessingml/2006/main" w:ilvl="1">
+      <w:start w:val="1"/>
+      <w:numFmt w:val="bullet"/>
+      <w:lvlText w:val="o"/>
+      <w:lvlJc w:val="left"/>
+      <w:pPr>
+        <w:ind w:left="1440" w:hanging="360"/>
+      </w:pPr>
+      <w:rPr>
+        <w:rFonts w:hint="default" w:ascii="Courier New" w:hAnsi="Courier New"/>
+      </w:rPr>
+    </w:lvl>
+    <w:lvl xmlns:w="http://schemas.openxmlformats.org/wordprocessingml/2006/main" w:ilvl="2">
+      <w:start w:val="1"/>
+      <w:numFmt w:val="bullet"/>
+      <w:lvlText w:val=""/>
+      <w:lvlJc w:val="left"/>
+      <w:pPr>
+        <w:ind w:left="2160" w:hanging="360"/>
+      </w:pPr>
+      <w:rPr>
+        <w:rFonts w:hint="default" w:ascii="Wingdings" w:hAnsi="Wingdings"/>
+      </w:rPr>
+    </w:lvl>
+    <w:lvl xmlns:w="http://schemas.openxmlformats.org/wordprocessingml/2006/main" w:ilvl="3">
+      <w:start w:val="1"/>
+      <w:numFmt w:val="bullet"/>
+      <w:lvlText w:val=""/>
+      <w:lvlJc w:val="left"/>
+      <w:pPr>
+        <w:ind w:left="2880" w:hanging="360"/>
+      </w:pPr>
+      <w:rPr>
+        <w:rFonts w:hint="default" w:ascii="Symbol" w:hAnsi="Symbol"/>
+      </w:rPr>
+    </w:lvl>
+    <w:lvl xmlns:w="http://schemas.openxmlformats.org/wordprocessingml/2006/main" w:ilvl="4">
+      <w:start w:val="1"/>
+      <w:numFmt w:val="bullet"/>
+      <w:lvlText w:val="o"/>
+      <w:lvlJc w:val="left"/>
+      <w:pPr>
+        <w:ind w:left="3600" w:hanging="360"/>
+      </w:pPr>
+      <w:rPr>
+        <w:rFonts w:hint="default" w:ascii="Courier New" w:hAnsi="Courier New"/>
+      </w:rPr>
+    </w:lvl>
+    <w:lvl xmlns:w="http://schemas.openxmlformats.org/wordprocessingml/2006/main" w:ilvl="5">
+      <w:start w:val="1"/>
+      <w:numFmt w:val="bullet"/>
+      <w:lvlText w:val=""/>
+      <w:lvlJc w:val="left"/>
+      <w:pPr>
+        <w:ind w:left="4320" w:hanging="360"/>
+      </w:pPr>
+      <w:rPr>
+        <w:rFonts w:hint="default" w:ascii="Wingdings" w:hAnsi="Wingdings"/>
+      </w:rPr>
+    </w:lvl>
+    <w:lvl xmlns:w="http://schemas.openxmlformats.org/wordprocessingml/2006/main" w:ilvl="6">
+      <w:start w:val="1"/>
+      <w:numFmt w:val="bullet"/>
+      <w:lvlText w:val=""/>
+      <w:lvlJc w:val="left"/>
+      <w:pPr>
+        <w:ind w:left="5040" w:hanging="360"/>
+      </w:pPr>
+      <w:rPr>
+        <w:rFonts w:hint="default" w:ascii="Symbol" w:hAnsi="Symbol"/>
+      </w:rPr>
+    </w:lvl>
+    <w:lvl xmlns:w="http://schemas.openxmlformats.org/wordprocessingml/2006/main" w:ilvl="7">
+      <w:start w:val="1"/>
+      <w:numFmt w:val="bullet"/>
+      <w:lvlText w:val="o"/>
+      <w:lvlJc w:val="left"/>
+      <w:pPr>
+        <w:ind w:left="5760" w:hanging="360"/>
+      </w:pPr>
+      <w:rPr>
+        <w:rFonts w:hint="default" w:ascii="Courier New" w:hAnsi="Courier New"/>
+      </w:rPr>
+    </w:lvl>
+    <w:lvl xmlns:w="http://schemas.openxmlformats.org/wordprocessingml/2006/main" w:ilvl="8">
+      <w:start w:val="1"/>
+      <w:numFmt w:val="bullet"/>
+      <w:lvlText w:val=""/>
+      <w:lvlJc w:val="left"/>
+      <w:pPr>
+        <w:ind w:left="6480" w:hanging="360"/>
+      </w:pPr>
+      <w:rPr>
+        <w:rFonts w:hint="default" w:ascii="Wingdings" w:hAnsi="Wingdings"/>
+      </w:rPr>
+    </w:lvl>
+  </w:abstractNum>
   <w:abstractNum xmlns:w="http://schemas.openxmlformats.org/wordprocessingml/2006/main" w:abstractNumId="38">
     <w:nsid w:val="206e55e0"/>
     <w:multiLevelType xmlns:w="http://schemas.openxmlformats.org/wordprocessingml/2006/main" w:val="hybridMultilevel"/>
@@ -8004,6 +11031,15 @@
       </w:rPr>
     </w:lvl>
   </w:abstractNum>
+  <w:num w:numId="42">
+    <w:abstractNumId w:val="41"/>
+  </w:num>
+  <w:num w:numId="41">
+    <w:abstractNumId w:val="40"/>
+  </w:num>
+  <w:num w:numId="40">
+    <w:abstractNumId w:val="39"/>
+  </w:num>
   <w:num w:numId="39">
     <w:abstractNumId w:val="38"/>
   </w:num>

</xml_diff>

<commit_message>
add autoplay for LargImageCard
</commit_message>
<xml_diff>
--- a/documentation/Koodidokumentin ohje_MatchGame.docx
+++ b/documentation/Koodidokumentin ohje_MatchGame.docx
@@ -95,6 +95,45 @@
           <w:lang w:val="fi-FI"/>
         </w:rPr>
         <w:t>Minigames</w:t>
+      </w:r>
+    </w:p>
+    <w:p>
+      <w:pPr>
+        <w:pStyle w:val="Normaali"/>
+      </w:pPr>
+      <w:r>
+        <w:rPr>
+          <w:rFonts w:ascii="Calibri" w:hAnsi="Calibri" w:eastAsia="Calibri" w:cs="Calibri"/>
+          <w:b w:val="1"/>
+          <w:bCs w:val="1"/>
+          <w:noProof w:val="0"/>
+          <w:sz w:val="20"/>
+          <w:szCs w:val="20"/>
+          <w:lang w:val="fi-FI"/>
+        </w:rPr>
+        <w:t>Customer</w:t>
+      </w:r>
+      <w:r>
+        <w:rPr>
+          <w:rFonts w:ascii="Calibri" w:hAnsi="Calibri" w:eastAsia="Calibri" w:cs="Calibri"/>
+          <w:b w:val="1"/>
+          <w:bCs w:val="1"/>
+          <w:noProof w:val="0"/>
+          <w:sz w:val="20"/>
+          <w:szCs w:val="20"/>
+          <w:lang w:val="fi-FI"/>
+        </w:rPr>
+        <w:t>:</w:t>
+      </w:r>
+      <w:r>
+        <w:rPr>
+          <w:rFonts w:ascii="Calibri" w:hAnsi="Calibri" w:eastAsia="Calibri" w:cs="Calibri"/>
+          <w:noProof w:val="0"/>
+          <w:sz w:val="20"/>
+          <w:szCs w:val="20"/>
+          <w:lang w:val="fi-FI"/>
+        </w:rPr>
+        <w:t xml:space="preserve"> GreyLandGames</w:t>
       </w:r>
       <w:r>
         <w:rPr>
@@ -4302,7 +4341,7 @@
       </w:pPr>
       <w:r>
         <w:drawing>
-          <wp:inline wp14:editId="53CD3316" wp14:anchorId="28D8F430">
+          <wp:inline wp14:editId="67DAB4C1" wp14:anchorId="28D8F430">
             <wp:extent cx="6000750" cy="3543300"/>
             <wp:effectExtent l="0" t="0" r="0" b="0"/>
             <wp:docPr id="1672604853" name="drawing"/>
@@ -4345,7 +4384,7 @@
       </w:r>
       <w:r>
         <w:drawing>
-          <wp:inline wp14:editId="2A1D3762" wp14:anchorId="377F0117">
+          <wp:inline wp14:editId="774A751A" wp14:anchorId="377F0117">
             <wp:extent cx="6000750" cy="3505200"/>
             <wp:effectExtent l="0" t="0" r="0" b="0"/>
             <wp:docPr id="244497104" name="drawing"/>
@@ -4391,7 +4430,7 @@
       </w:r>
       <w:r>
         <w:drawing>
-          <wp:inline wp14:editId="3E367029" wp14:anchorId="67C04F37">
+          <wp:inline wp14:editId="657F8952" wp14:anchorId="67C04F37">
             <wp:extent cx="6000750" cy="3533775"/>
             <wp:effectExtent l="0" t="0" r="0" b="0"/>
             <wp:docPr id="1237200703" name="drawing"/>
@@ -4432,12 +4471,18 @@
           </wp:inline>
         </w:drawing>
       </w:r>
+    </w:p>
+    <w:p>
+      <w:pPr>
+        <w:pStyle w:val="Luettelokappale"/>
+        <w:ind w:left="720"/>
+      </w:pPr>
       <w:r>
         <w:drawing>
-          <wp:inline wp14:editId="1C7E026B" wp14:anchorId="7D8CFCCC">
-            <wp:extent cx="6000750" cy="3238500"/>
+          <wp:inline wp14:editId="44924018" wp14:anchorId="642392F4">
+            <wp:extent cx="5991225" cy="3499462"/>
             <wp:effectExtent l="0" t="0" r="0" b="0"/>
-            <wp:docPr id="1475630487" name="drawing"/>
+            <wp:docPr id="1259185476" name="drawing"/>
             <wp:cNvGraphicFramePr>
               <a:graphicFrameLocks noChangeAspect="1"/>
             </wp:cNvGraphicFramePr>
@@ -4445,14 +4490,14 @@
               <a:graphicData xmlns:a="http://schemas.openxmlformats.org/drawingml/2006/main" uri="http://schemas.openxmlformats.org/drawingml/2006/picture">
                 <pic:pic xmlns:pic="http://schemas.openxmlformats.org/drawingml/2006/picture">
                   <pic:nvPicPr>
-                    <pic:cNvPr id="1475630487" name=""/>
+                    <pic:cNvPr id="1259185476" name=""/>
                     <pic:cNvPicPr/>
                   </pic:nvPicPr>
                   <pic:blipFill>
-                    <a:blip xmlns:r="http://schemas.openxmlformats.org/officeDocument/2006/relationships" r:embed="rId12386870">
+                    <a:blip xmlns:r="http://schemas.openxmlformats.org/officeDocument/2006/relationships" r:embed="rId1661875380">
                       <a:extLst>
-                        <a:ext xmlns:a="http://schemas.openxmlformats.org/drawingml/2006/main" uri="{28A0092B-C50C-407E-A947-70E740481C1C}">
-                          <a14:useLocalDpi xmlns:a14="http://schemas.microsoft.com/office/drawing/2010/main" val="0"/>
+                        <a:ext uri="{28A0092B-C50C-407E-A947-70E740481C1C}">
+                          <a14:useLocalDpi xmlns:a14="http://schemas.microsoft.com/office/drawing/2010/main"/>
                         </a:ext>
                       </a:extLst>
                     </a:blip>
@@ -4461,9 +4506,9 @@
                     </a:stretch>
                   </pic:blipFill>
                   <pic:spPr>
-                    <a:xfrm>
+                    <a:xfrm rot="0">
                       <a:off x="0" y="0"/>
-                      <a:ext cx="6000750" cy="3238500"/>
+                      <a:ext cx="5991225" cy="3499462"/>
                     </a:xfrm>
                     <a:prstGeom prst="rect">
                       <a:avLst/>
@@ -4475,6 +4520,12 @@
           </wp:inline>
         </w:drawing>
       </w:r>
+    </w:p>
+    <w:p>
+      <w:pPr>
+        <w:pStyle w:val="Luettelokappale"/>
+        <w:ind w:left="720"/>
+      </w:pPr>
     </w:p>
     <w:p>
       <w:pPr>

</xml_diff>